<commit_message>
Update manuscript with X13 review revisions
</commit_message>
<xml_diff>
--- a/Manuscript.docx
+++ b/Manuscript.docx
@@ -1248,6 +1248,2812 @@
     </w:p>
     <w:p>
       <w:pPr>
+        <w:pStyle w:val="CaptionText"/>
+        <w:keepNext/>
+      </w:pPr>
+      <w:r>
+        <w:t>Table 2. Longitudinal sample distribution, productive receptor coverage, and sequencing availability.</w:t>
+      </w:r>
+    </w:p>
+    <w:tbl>
+      <w:tblPr>
+        <w:tblStyle w:val="TableGrid"/>
+        <w:tblW w:type="dxa" w:w="9360"/>
+        <w:jc w:val="left"/>
+        <w:tblLayout w:type="fixed"/>
+        <w:tblLook w:firstColumn="1" w:firstRow="1" w:lastColumn="0" w:lastRow="0" w:noHBand="0" w:noVBand="1" w:val="04A0"/>
+        <w:tblInd w:w="120" w:type="dxa"/>
+      </w:tblPr>
+      <w:tblGrid>
+        <w:gridCol w:w="950"/>
+        <w:gridCol w:w="1600"/>
+        <w:gridCol w:w="1450"/>
+        <w:gridCol w:w="850"/>
+        <w:gridCol w:w="800"/>
+        <w:gridCol w:w="2050"/>
+        <w:gridCol w:w="1660"/>
+      </w:tblGrid>
+      <w:tr>
+        <w:trPr>
+          <w:cantSplit/>
+          <w:tblHeader w:val="true"/>
+        </w:trPr>
+        <w:tc>
+          <w:tcPr>
+            <w:tcW w:type="dxa" w:w="950"/>
+            <w:tcMar>
+              <w:top w:w="80" w:type="dxa"/>
+              <w:start w:w="120" w:type="dxa"/>
+              <w:bottom w:w="80" w:type="dxa"/>
+              <w:end w:w="120" w:type="dxa"/>
+            </w:tcMar>
+            <w:vAlign w:val="center"/>
+            <w:shd w:fill="F2F4F7"/>
+          </w:tcPr>
+          <w:p>
+            <w:pPr>
+              <w:spacing w:before="0" w:after="0" w:line="240" w:lineRule="auto"/>
+            </w:pPr>
+            <w:r>
+              <w:rPr>
+                <w:rFonts w:ascii="Calibri" w:hAnsi="Calibri"/>
+                <w:b/>
+                <w:sz w:val="19"/>
+              </w:rPr>
+            </w:r>
+            <w:r>
+              <w:rPr>
+                <w:rFonts w:ascii="Calibri" w:hAnsi="Calibri"/>
+                <w:b/>
+                <w:sz w:val="19"/>
+              </w:rPr>
+              <w:t>Patient</w:t>
+            </w:r>
+          </w:p>
+        </w:tc>
+        <w:tc>
+          <w:tcPr>
+            <w:tcW w:type="dxa" w:w="1600"/>
+            <w:tcMar>
+              <w:top w:w="80" w:type="dxa"/>
+              <w:start w:w="120" w:type="dxa"/>
+              <w:bottom w:w="80" w:type="dxa"/>
+              <w:end w:w="120" w:type="dxa"/>
+            </w:tcMar>
+            <w:vAlign w:val="center"/>
+            <w:shd w:fill="F2F4F7"/>
+          </w:tcPr>
+          <w:p>
+            <w:pPr>
+              <w:spacing w:before="0" w:after="0" w:line="240" w:lineRule="auto"/>
+              <w:jc w:val="center"/>
+            </w:pPr>
+            <w:r>
+              <w:rPr>
+                <w:rFonts w:ascii="Calibri" w:hAnsi="Calibri"/>
+                <w:b/>
+                <w:sz w:val="19"/>
+              </w:rPr>
+            </w:r>
+            <w:r>
+              <w:rPr>
+                <w:rFonts w:ascii="Calibri" w:hAnsi="Calibri"/>
+                <w:b/>
+                <w:sz w:val="19"/>
+              </w:rPr>
+              <w:t>Outcome</w:t>
+            </w:r>
+          </w:p>
+        </w:tc>
+        <w:tc>
+          <w:tcPr>
+            <w:tcW w:type="dxa" w:w="1450"/>
+            <w:tcMar>
+              <w:top w:w="80" w:type="dxa"/>
+              <w:start w:w="120" w:type="dxa"/>
+              <w:bottom w:w="80" w:type="dxa"/>
+              <w:end w:w="120" w:type="dxa"/>
+            </w:tcMar>
+            <w:vAlign w:val="center"/>
+            <w:shd w:fill="F2F4F7"/>
+          </w:tcPr>
+          <w:p>
+            <w:pPr>
+              <w:spacing w:before="0" w:after="0" w:line="240" w:lineRule="auto"/>
+              <w:jc w:val="center"/>
+            </w:pPr>
+            <w:r>
+              <w:rPr>
+                <w:rFonts w:ascii="Calibri" w:hAnsi="Calibri"/>
+                <w:b/>
+                <w:sz w:val="19"/>
+              </w:rPr>
+            </w:r>
+            <w:r>
+              <w:rPr>
+                <w:rFonts w:ascii="Calibri" w:hAnsi="Calibri"/>
+                <w:b/>
+                <w:sz w:val="19"/>
+              </w:rPr>
+              <w:t>Timepoint</w:t>
+            </w:r>
+          </w:p>
+        </w:tc>
+        <w:tc>
+          <w:tcPr>
+            <w:tcW w:type="dxa" w:w="850"/>
+            <w:tcMar>
+              <w:top w:w="80" w:type="dxa"/>
+              <w:start w:w="120" w:type="dxa"/>
+              <w:bottom w:w="80" w:type="dxa"/>
+              <w:end w:w="120" w:type="dxa"/>
+            </w:tcMar>
+            <w:vAlign w:val="center"/>
+            <w:shd w:fill="F2F4F7"/>
+          </w:tcPr>
+          <w:p>
+            <w:pPr>
+              <w:spacing w:before="0" w:after="0" w:line="240" w:lineRule="auto"/>
+              <w:jc w:val="center"/>
+            </w:pPr>
+            <w:r>
+              <w:rPr>
+                <w:rFonts w:ascii="Calibri" w:hAnsi="Calibri"/>
+                <w:b/>
+                <w:sz w:val="19"/>
+              </w:rPr>
+            </w:r>
+            <w:r>
+              <w:rPr>
+                <w:rFonts w:ascii="Calibri" w:hAnsi="Calibri"/>
+                <w:b/>
+                <w:sz w:val="19"/>
+              </w:rPr>
+              <w:t>Sample</w:t>
+            </w:r>
+          </w:p>
+        </w:tc>
+        <w:tc>
+          <w:tcPr>
+            <w:tcW w:type="dxa" w:w="800"/>
+            <w:tcMar>
+              <w:top w:w="80" w:type="dxa"/>
+              <w:start w:w="120" w:type="dxa"/>
+              <w:bottom w:w="80" w:type="dxa"/>
+              <w:end w:w="120" w:type="dxa"/>
+            </w:tcMar>
+            <w:vAlign w:val="center"/>
+            <w:shd w:fill="F2F4F7"/>
+          </w:tcPr>
+          <w:p>
+            <w:pPr>
+              <w:spacing w:before="0" w:after="0" w:line="240" w:lineRule="auto"/>
+              <w:jc w:val="center"/>
+            </w:pPr>
+            <w:r>
+              <w:rPr>
+                <w:rFonts w:ascii="Calibri" w:hAnsi="Calibri"/>
+                <w:b/>
+                <w:sz w:val="19"/>
+              </w:rPr>
+            </w:r>
+            <w:r>
+              <w:rPr>
+                <w:rFonts w:ascii="Calibri" w:hAnsi="Calibri"/>
+                <w:b/>
+                <w:sz w:val="19"/>
+              </w:rPr>
+              <w:t>Cells</w:t>
+            </w:r>
+          </w:p>
+        </w:tc>
+        <w:tc>
+          <w:tcPr>
+            <w:tcW w:type="dxa" w:w="2050"/>
+            <w:tcMar>
+              <w:top w:w="80" w:type="dxa"/>
+              <w:start w:w="120" w:type="dxa"/>
+              <w:bottom w:w="80" w:type="dxa"/>
+              <w:end w:w="120" w:type="dxa"/>
+            </w:tcMar>
+            <w:vAlign w:val="center"/>
+            <w:shd w:fill="F2F4F7"/>
+          </w:tcPr>
+          <w:p>
+            <w:pPr>
+              <w:spacing w:before="0" w:after="0" w:line="240" w:lineRule="auto"/>
+              <w:jc w:val="center"/>
+            </w:pPr>
+            <w:r>
+              <w:rPr>
+                <w:rFonts w:ascii="Calibri" w:hAnsi="Calibri"/>
+                <w:b/>
+                <w:sz w:val="19"/>
+              </w:rPr>
+            </w:r>
+            <w:r>
+              <w:rPr>
+                <w:rFonts w:ascii="Calibri" w:hAnsi="Calibri"/>
+                <w:b/>
+                <w:sz w:val="19"/>
+              </w:rPr>
+              <w:t>Productive TRA / TRB, %</w:t>
+            </w:r>
+          </w:p>
+        </w:tc>
+        <w:tc>
+          <w:tcPr>
+            <w:tcW w:type="dxa" w:w="1660"/>
+            <w:tcMar>
+              <w:top w:w="80" w:type="dxa"/>
+              <w:start w:w="120" w:type="dxa"/>
+              <w:bottom w:w="80" w:type="dxa"/>
+              <w:end w:w="120" w:type="dxa"/>
+            </w:tcMar>
+            <w:vAlign w:val="center"/>
+            <w:shd w:fill="F2F4F7"/>
+          </w:tcPr>
+          <w:p>
+            <w:pPr>
+              <w:spacing w:before="0" w:after="0" w:line="240" w:lineRule="auto"/>
+              <w:jc w:val="center"/>
+            </w:pPr>
+            <w:r>
+              <w:rPr>
+                <w:rFonts w:ascii="Calibri" w:hAnsi="Calibri"/>
+                <w:b/>
+                <w:sz w:val="19"/>
+              </w:rPr>
+            </w:r>
+            <w:r>
+              <w:rPr>
+                <w:rFonts w:ascii="Calibri" w:hAnsi="Calibri"/>
+                <w:b/>
+                <w:sz w:val="19"/>
+              </w:rPr>
+              <w:t>Sequencing modality</w:t>
+            </w:r>
+          </w:p>
+        </w:tc>
+      </w:tr>
+      <w:tr>
+        <w:trPr>
+          <w:cantSplit/>
+        </w:trPr>
+        <w:tc>
+          <w:tcPr>
+            <w:tcW w:type="dxa" w:w="950"/>
+            <w:tcMar>
+              <w:top w:w="80" w:type="dxa"/>
+              <w:start w:w="120" w:type="dxa"/>
+              <w:bottom w:w="80" w:type="dxa"/>
+              <w:end w:w="120" w:type="dxa"/>
+            </w:tcMar>
+            <w:vAlign w:val="center"/>
+          </w:tcPr>
+          <w:p>
+            <w:pPr>
+              <w:spacing w:before="0" w:after="0" w:line="240" w:lineRule="auto"/>
+            </w:pPr>
+            <w:r>
+              <w:rPr>
+                <w:rFonts w:ascii="Calibri" w:hAnsi="Calibri"/>
+                <w:b w:val="0"/>
+                <w:sz w:val="19"/>
+              </w:rPr>
+            </w:r>
+            <w:r>
+              <w:rPr>
+                <w:rFonts w:ascii="Calibri" w:hAnsi="Calibri"/>
+                <w:b w:val="0"/>
+                <w:sz w:val="19"/>
+              </w:rPr>
+              <w:t>Patient 1</w:t>
+            </w:r>
+          </w:p>
+        </w:tc>
+        <w:tc>
+          <w:tcPr>
+            <w:tcW w:type="dxa" w:w="1600"/>
+            <w:tcMar>
+              <w:top w:w="80" w:type="dxa"/>
+              <w:start w:w="120" w:type="dxa"/>
+              <w:bottom w:w="80" w:type="dxa"/>
+              <w:end w:w="120" w:type="dxa"/>
+            </w:tcMar>
+            <w:vAlign w:val="center"/>
+          </w:tcPr>
+          <w:p>
+            <w:pPr>
+              <w:spacing w:before="0" w:after="0" w:line="240" w:lineRule="auto"/>
+            </w:pPr>
+            <w:r>
+              <w:rPr>
+                <w:rFonts w:ascii="Calibri" w:hAnsi="Calibri"/>
+                <w:b w:val="0"/>
+                <w:sz w:val="19"/>
+              </w:rPr>
+            </w:r>
+            <w:r>
+              <w:rPr>
+                <w:rFonts w:ascii="Calibri" w:hAnsi="Calibri"/>
+                <w:b w:val="0"/>
+                <w:sz w:val="19"/>
+              </w:rPr>
+              <w:t>Responder</w:t>
+            </w:r>
+          </w:p>
+        </w:tc>
+        <w:tc>
+          <w:tcPr>
+            <w:tcW w:type="dxa" w:w="1450"/>
+            <w:tcMar>
+              <w:top w:w="80" w:type="dxa"/>
+              <w:start w:w="120" w:type="dxa"/>
+              <w:bottom w:w="80" w:type="dxa"/>
+              <w:end w:w="120" w:type="dxa"/>
+            </w:tcMar>
+            <w:vAlign w:val="center"/>
+          </w:tcPr>
+          <w:p>
+            <w:pPr>
+              <w:spacing w:before="0" w:after="0" w:line="240" w:lineRule="auto"/>
+            </w:pPr>
+            <w:r>
+              <w:rPr>
+                <w:rFonts w:ascii="Calibri" w:hAnsi="Calibri"/>
+                <w:b w:val="0"/>
+                <w:sz w:val="19"/>
+              </w:rPr>
+            </w:r>
+            <w:r>
+              <w:rPr>
+                <w:rFonts w:ascii="Calibri" w:hAnsi="Calibri"/>
+                <w:b w:val="0"/>
+                <w:sz w:val="19"/>
+              </w:rPr>
+              <w:t>Baseline</w:t>
+            </w:r>
+          </w:p>
+        </w:tc>
+        <w:tc>
+          <w:tcPr>
+            <w:tcW w:type="dxa" w:w="850"/>
+            <w:tcMar>
+              <w:top w:w="80" w:type="dxa"/>
+              <w:start w:w="120" w:type="dxa"/>
+              <w:bottom w:w="80" w:type="dxa"/>
+              <w:end w:w="120" w:type="dxa"/>
+            </w:tcMar>
+            <w:vAlign w:val="center"/>
+          </w:tcPr>
+          <w:p>
+            <w:pPr>
+              <w:spacing w:before="0" w:after="0" w:line="240" w:lineRule="auto"/>
+            </w:pPr>
+            <w:r>
+              <w:rPr>
+                <w:rFonts w:ascii="Calibri" w:hAnsi="Calibri"/>
+                <w:b w:val="0"/>
+                <w:sz w:val="19"/>
+              </w:rPr>
+            </w:r>
+            <w:r>
+              <w:rPr>
+                <w:rFonts w:ascii="Calibri" w:hAnsi="Calibri"/>
+                <w:b w:val="0"/>
+                <w:sz w:val="19"/>
+              </w:rPr>
+              <w:t>S1</w:t>
+            </w:r>
+          </w:p>
+        </w:tc>
+        <w:tc>
+          <w:tcPr>
+            <w:tcW w:type="dxa" w:w="800"/>
+            <w:tcMar>
+              <w:top w:w="80" w:type="dxa"/>
+              <w:start w:w="120" w:type="dxa"/>
+              <w:bottom w:w="80" w:type="dxa"/>
+              <w:end w:w="120" w:type="dxa"/>
+            </w:tcMar>
+            <w:vAlign w:val="center"/>
+          </w:tcPr>
+          <w:p>
+            <w:pPr>
+              <w:spacing w:before="0" w:after="0" w:line="240" w:lineRule="auto"/>
+              <w:jc w:val="center"/>
+            </w:pPr>
+            <w:r>
+              <w:rPr>
+                <w:rFonts w:ascii="Calibri" w:hAnsi="Calibri"/>
+                <w:b w:val="0"/>
+                <w:sz w:val="19"/>
+              </w:rPr>
+            </w:r>
+            <w:r>
+              <w:rPr>
+                <w:rFonts w:ascii="Calibri" w:hAnsi="Calibri"/>
+                <w:b w:val="0"/>
+                <w:sz w:val="19"/>
+              </w:rPr>
+              <w:t>8931</w:t>
+            </w:r>
+          </w:p>
+        </w:tc>
+        <w:tc>
+          <w:tcPr>
+            <w:tcW w:type="dxa" w:w="2050"/>
+            <w:tcMar>
+              <w:top w:w="80" w:type="dxa"/>
+              <w:start w:w="120" w:type="dxa"/>
+              <w:bottom w:w="80" w:type="dxa"/>
+              <w:end w:w="120" w:type="dxa"/>
+            </w:tcMar>
+            <w:vAlign w:val="center"/>
+          </w:tcPr>
+          <w:p>
+            <w:pPr>
+              <w:spacing w:before="0" w:after="0" w:line="240" w:lineRule="auto"/>
+            </w:pPr>
+            <w:r>
+              <w:rPr>
+                <w:rFonts w:ascii="Calibri" w:hAnsi="Calibri"/>
+                <w:b w:val="0"/>
+                <w:sz w:val="19"/>
+              </w:rPr>
+            </w:r>
+            <w:r>
+              <w:rPr>
+                <w:rFonts w:ascii="Calibri" w:hAnsi="Calibri"/>
+                <w:b w:val="0"/>
+                <w:sz w:val="19"/>
+              </w:rPr>
+              <w:t>44.9 / 52.7</w:t>
+            </w:r>
+          </w:p>
+        </w:tc>
+        <w:tc>
+          <w:tcPr>
+            <w:tcW w:type="dxa" w:w="1660"/>
+            <w:tcMar>
+              <w:top w:w="80" w:type="dxa"/>
+              <w:start w:w="120" w:type="dxa"/>
+              <w:bottom w:w="80" w:type="dxa"/>
+              <w:end w:w="120" w:type="dxa"/>
+            </w:tcMar>
+            <w:vAlign w:val="center"/>
+          </w:tcPr>
+          <w:p>
+            <w:pPr>
+              <w:spacing w:before="0" w:after="0" w:line="240" w:lineRule="auto"/>
+            </w:pPr>
+            <w:r>
+              <w:rPr>
+                <w:rFonts w:ascii="Calibri" w:hAnsi="Calibri"/>
+                <w:b w:val="0"/>
+                <w:sz w:val="19"/>
+              </w:rPr>
+            </w:r>
+            <w:r>
+              <w:rPr>
+                <w:rFonts w:ascii="Calibri" w:hAnsi="Calibri"/>
+                <w:b w:val="0"/>
+                <w:sz w:val="19"/>
+              </w:rPr>
+              <w:t>RNA + V(D)J</w:t>
+            </w:r>
+          </w:p>
+        </w:tc>
+      </w:tr>
+      <w:tr>
+        <w:trPr>
+          <w:cantSplit/>
+        </w:trPr>
+        <w:tc>
+          <w:tcPr>
+            <w:tcW w:type="dxa" w:w="950"/>
+            <w:tcMar>
+              <w:top w:w="80" w:type="dxa"/>
+              <w:start w:w="120" w:type="dxa"/>
+              <w:bottom w:w="80" w:type="dxa"/>
+              <w:end w:w="120" w:type="dxa"/>
+            </w:tcMar>
+            <w:vAlign w:val="center"/>
+          </w:tcPr>
+          <w:p>
+            <w:pPr>
+              <w:spacing w:before="0" w:after="0" w:line="240" w:lineRule="auto"/>
+            </w:pPr>
+            <w:r>
+              <w:rPr>
+                <w:rFonts w:ascii="Calibri" w:hAnsi="Calibri"/>
+                <w:b w:val="0"/>
+                <w:sz w:val="19"/>
+              </w:rPr>
+            </w:r>
+            <w:r>
+              <w:rPr>
+                <w:rFonts w:ascii="Calibri" w:hAnsi="Calibri"/>
+                <w:b w:val="0"/>
+                <w:sz w:val="19"/>
+              </w:rPr>
+              <w:t>Patient 1</w:t>
+            </w:r>
+          </w:p>
+        </w:tc>
+        <w:tc>
+          <w:tcPr>
+            <w:tcW w:type="dxa" w:w="1600"/>
+            <w:tcMar>
+              <w:top w:w="80" w:type="dxa"/>
+              <w:start w:w="120" w:type="dxa"/>
+              <w:bottom w:w="80" w:type="dxa"/>
+              <w:end w:w="120" w:type="dxa"/>
+            </w:tcMar>
+            <w:vAlign w:val="center"/>
+          </w:tcPr>
+          <w:p>
+            <w:pPr>
+              <w:spacing w:before="0" w:after="0" w:line="240" w:lineRule="auto"/>
+            </w:pPr>
+            <w:r>
+              <w:rPr>
+                <w:rFonts w:ascii="Calibri" w:hAnsi="Calibri"/>
+                <w:b w:val="0"/>
+                <w:sz w:val="19"/>
+              </w:rPr>
+            </w:r>
+            <w:r>
+              <w:rPr>
+                <w:rFonts w:ascii="Calibri" w:hAnsi="Calibri"/>
+                <w:b w:val="0"/>
+                <w:sz w:val="19"/>
+              </w:rPr>
+              <w:t>Responder</w:t>
+            </w:r>
+          </w:p>
+        </w:tc>
+        <w:tc>
+          <w:tcPr>
+            <w:tcW w:type="dxa" w:w="1450"/>
+            <w:tcMar>
+              <w:top w:w="80" w:type="dxa"/>
+              <w:start w:w="120" w:type="dxa"/>
+              <w:bottom w:w="80" w:type="dxa"/>
+              <w:end w:w="120" w:type="dxa"/>
+            </w:tcMar>
+            <w:vAlign w:val="center"/>
+          </w:tcPr>
+          <w:p>
+            <w:pPr>
+              <w:spacing w:before="0" w:after="0" w:line="240" w:lineRule="auto"/>
+            </w:pPr>
+            <w:r>
+              <w:rPr>
+                <w:rFonts w:ascii="Calibri" w:hAnsi="Calibri"/>
+                <w:b w:val="0"/>
+                <w:sz w:val="19"/>
+              </w:rPr>
+            </w:r>
+            <w:r>
+              <w:rPr>
+                <w:rFonts w:ascii="Calibri" w:hAnsi="Calibri"/>
+                <w:b w:val="0"/>
+                <w:sz w:val="19"/>
+              </w:rPr>
+              <w:t>Post-treatment</w:t>
+            </w:r>
+          </w:p>
+        </w:tc>
+        <w:tc>
+          <w:tcPr>
+            <w:tcW w:type="dxa" w:w="850"/>
+            <w:tcMar>
+              <w:top w:w="80" w:type="dxa"/>
+              <w:start w:w="120" w:type="dxa"/>
+              <w:bottom w:w="80" w:type="dxa"/>
+              <w:end w:w="120" w:type="dxa"/>
+            </w:tcMar>
+            <w:vAlign w:val="center"/>
+          </w:tcPr>
+          <w:p>
+            <w:pPr>
+              <w:spacing w:before="0" w:after="0" w:line="240" w:lineRule="auto"/>
+            </w:pPr>
+            <w:r>
+              <w:rPr>
+                <w:rFonts w:ascii="Calibri" w:hAnsi="Calibri"/>
+                <w:b w:val="0"/>
+                <w:sz w:val="19"/>
+              </w:rPr>
+            </w:r>
+            <w:r>
+              <w:rPr>
+                <w:rFonts w:ascii="Calibri" w:hAnsi="Calibri"/>
+                <w:b w:val="0"/>
+                <w:sz w:val="19"/>
+              </w:rPr>
+              <w:t>S2</w:t>
+            </w:r>
+          </w:p>
+        </w:tc>
+        <w:tc>
+          <w:tcPr>
+            <w:tcW w:type="dxa" w:w="800"/>
+            <w:tcMar>
+              <w:top w:w="80" w:type="dxa"/>
+              <w:start w:w="120" w:type="dxa"/>
+              <w:bottom w:w="80" w:type="dxa"/>
+              <w:end w:w="120" w:type="dxa"/>
+            </w:tcMar>
+            <w:vAlign w:val="center"/>
+          </w:tcPr>
+          <w:p>
+            <w:pPr>
+              <w:spacing w:before="0" w:after="0" w:line="240" w:lineRule="auto"/>
+              <w:jc w:val="center"/>
+            </w:pPr>
+            <w:r>
+              <w:rPr>
+                <w:rFonts w:ascii="Calibri" w:hAnsi="Calibri"/>
+                <w:b w:val="0"/>
+                <w:sz w:val="19"/>
+              </w:rPr>
+            </w:r>
+            <w:r>
+              <w:rPr>
+                <w:rFonts w:ascii="Calibri" w:hAnsi="Calibri"/>
+                <w:b w:val="0"/>
+                <w:sz w:val="19"/>
+              </w:rPr>
+              <w:t>9069</w:t>
+            </w:r>
+          </w:p>
+        </w:tc>
+        <w:tc>
+          <w:tcPr>
+            <w:tcW w:type="dxa" w:w="2050"/>
+            <w:tcMar>
+              <w:top w:w="80" w:type="dxa"/>
+              <w:start w:w="120" w:type="dxa"/>
+              <w:bottom w:w="80" w:type="dxa"/>
+              <w:end w:w="120" w:type="dxa"/>
+            </w:tcMar>
+            <w:vAlign w:val="center"/>
+          </w:tcPr>
+          <w:p>
+            <w:pPr>
+              <w:spacing w:before="0" w:after="0" w:line="240" w:lineRule="auto"/>
+            </w:pPr>
+            <w:r>
+              <w:rPr>
+                <w:rFonts w:ascii="Calibri" w:hAnsi="Calibri"/>
+                <w:b w:val="0"/>
+                <w:sz w:val="19"/>
+              </w:rPr>
+            </w:r>
+            <w:r>
+              <w:rPr>
+                <w:rFonts w:ascii="Calibri" w:hAnsi="Calibri"/>
+                <w:b w:val="0"/>
+                <w:sz w:val="19"/>
+              </w:rPr>
+              <w:t>42.5 / 51.3</w:t>
+            </w:r>
+          </w:p>
+        </w:tc>
+        <w:tc>
+          <w:tcPr>
+            <w:tcW w:type="dxa" w:w="1660"/>
+            <w:tcMar>
+              <w:top w:w="80" w:type="dxa"/>
+              <w:start w:w="120" w:type="dxa"/>
+              <w:bottom w:w="80" w:type="dxa"/>
+              <w:end w:w="120" w:type="dxa"/>
+            </w:tcMar>
+            <w:vAlign w:val="center"/>
+          </w:tcPr>
+          <w:p>
+            <w:pPr>
+              <w:spacing w:before="0" w:after="0" w:line="240" w:lineRule="auto"/>
+            </w:pPr>
+            <w:r>
+              <w:rPr>
+                <w:rFonts w:ascii="Calibri" w:hAnsi="Calibri"/>
+                <w:b w:val="0"/>
+                <w:sz w:val="19"/>
+              </w:rPr>
+            </w:r>
+            <w:r>
+              <w:rPr>
+                <w:rFonts w:ascii="Calibri" w:hAnsi="Calibri"/>
+                <w:b w:val="0"/>
+                <w:sz w:val="19"/>
+              </w:rPr>
+              <w:t>RNA + V(D)J</w:t>
+            </w:r>
+          </w:p>
+        </w:tc>
+      </w:tr>
+      <w:tr>
+        <w:trPr>
+          <w:cantSplit/>
+        </w:trPr>
+        <w:tc>
+          <w:tcPr>
+            <w:tcW w:type="dxa" w:w="950"/>
+            <w:tcMar>
+              <w:top w:w="80" w:type="dxa"/>
+              <w:start w:w="120" w:type="dxa"/>
+              <w:bottom w:w="80" w:type="dxa"/>
+              <w:end w:w="120" w:type="dxa"/>
+            </w:tcMar>
+            <w:vAlign w:val="center"/>
+          </w:tcPr>
+          <w:p>
+            <w:pPr>
+              <w:spacing w:before="0" w:after="0" w:line="240" w:lineRule="auto"/>
+            </w:pPr>
+            <w:r>
+              <w:rPr>
+                <w:rFonts w:ascii="Calibri" w:hAnsi="Calibri"/>
+                <w:b w:val="0"/>
+                <w:sz w:val="19"/>
+              </w:rPr>
+            </w:r>
+            <w:r>
+              <w:rPr>
+                <w:rFonts w:ascii="Calibri" w:hAnsi="Calibri"/>
+                <w:b w:val="0"/>
+                <w:sz w:val="19"/>
+              </w:rPr>
+              <w:t>Patient 1</w:t>
+            </w:r>
+          </w:p>
+        </w:tc>
+        <w:tc>
+          <w:tcPr>
+            <w:tcW w:type="dxa" w:w="1600"/>
+            <w:tcMar>
+              <w:top w:w="80" w:type="dxa"/>
+              <w:start w:w="120" w:type="dxa"/>
+              <w:bottom w:w="80" w:type="dxa"/>
+              <w:end w:w="120" w:type="dxa"/>
+            </w:tcMar>
+            <w:vAlign w:val="center"/>
+          </w:tcPr>
+          <w:p>
+            <w:pPr>
+              <w:spacing w:before="0" w:after="0" w:line="240" w:lineRule="auto"/>
+            </w:pPr>
+            <w:r>
+              <w:rPr>
+                <w:rFonts w:ascii="Calibri" w:hAnsi="Calibri"/>
+                <w:b w:val="0"/>
+                <w:sz w:val="19"/>
+              </w:rPr>
+            </w:r>
+            <w:r>
+              <w:rPr>
+                <w:rFonts w:ascii="Calibri" w:hAnsi="Calibri"/>
+                <w:b w:val="0"/>
+                <w:sz w:val="19"/>
+              </w:rPr>
+              <w:t>Responder</w:t>
+            </w:r>
+          </w:p>
+        </w:tc>
+        <w:tc>
+          <w:tcPr>
+            <w:tcW w:type="dxa" w:w="1450"/>
+            <w:tcMar>
+              <w:top w:w="80" w:type="dxa"/>
+              <w:start w:w="120" w:type="dxa"/>
+              <w:bottom w:w="80" w:type="dxa"/>
+              <w:end w:w="120" w:type="dxa"/>
+            </w:tcMar>
+            <w:vAlign w:val="center"/>
+          </w:tcPr>
+          <w:p>
+            <w:pPr>
+              <w:spacing w:before="0" w:after="0" w:line="240" w:lineRule="auto"/>
+            </w:pPr>
+            <w:r>
+              <w:rPr>
+                <w:rFonts w:ascii="Calibri" w:hAnsi="Calibri"/>
+                <w:b w:val="0"/>
+                <w:sz w:val="19"/>
+              </w:rPr>
+            </w:r>
+            <w:r>
+              <w:rPr>
+                <w:rFonts w:ascii="Calibri" w:hAnsi="Calibri"/>
+                <w:b w:val="0"/>
+                <w:sz w:val="19"/>
+              </w:rPr>
+              <w:t>Recurrence</w:t>
+            </w:r>
+          </w:p>
+        </w:tc>
+        <w:tc>
+          <w:tcPr>
+            <w:tcW w:type="dxa" w:w="850"/>
+            <w:tcMar>
+              <w:top w:w="80" w:type="dxa"/>
+              <w:start w:w="120" w:type="dxa"/>
+              <w:bottom w:w="80" w:type="dxa"/>
+              <w:end w:w="120" w:type="dxa"/>
+            </w:tcMar>
+            <w:vAlign w:val="center"/>
+          </w:tcPr>
+          <w:p>
+            <w:pPr>
+              <w:spacing w:before="0" w:after="0" w:line="240" w:lineRule="auto"/>
+            </w:pPr>
+            <w:r>
+              <w:rPr>
+                <w:rFonts w:ascii="Calibri" w:hAnsi="Calibri"/>
+                <w:b w:val="0"/>
+                <w:sz w:val="19"/>
+              </w:rPr>
+            </w:r>
+            <w:r>
+              <w:rPr>
+                <w:rFonts w:ascii="Calibri" w:hAnsi="Calibri"/>
+                <w:b w:val="0"/>
+                <w:sz w:val="19"/>
+              </w:rPr>
+              <w:t>S3</w:t>
+            </w:r>
+          </w:p>
+        </w:tc>
+        <w:tc>
+          <w:tcPr>
+            <w:tcW w:type="dxa" w:w="800"/>
+            <w:tcMar>
+              <w:top w:w="80" w:type="dxa"/>
+              <w:start w:w="120" w:type="dxa"/>
+              <w:bottom w:w="80" w:type="dxa"/>
+              <w:end w:w="120" w:type="dxa"/>
+            </w:tcMar>
+            <w:vAlign w:val="center"/>
+          </w:tcPr>
+          <w:p>
+            <w:pPr>
+              <w:spacing w:before="0" w:after="0" w:line="240" w:lineRule="auto"/>
+              <w:jc w:val="center"/>
+            </w:pPr>
+            <w:r>
+              <w:rPr>
+                <w:rFonts w:ascii="Calibri" w:hAnsi="Calibri"/>
+                <w:b w:val="0"/>
+                <w:sz w:val="19"/>
+              </w:rPr>
+            </w:r>
+            <w:r>
+              <w:rPr>
+                <w:rFonts w:ascii="Calibri" w:hAnsi="Calibri"/>
+                <w:b w:val="0"/>
+                <w:sz w:val="19"/>
+              </w:rPr>
+              <w:t>7358</w:t>
+            </w:r>
+          </w:p>
+        </w:tc>
+        <w:tc>
+          <w:tcPr>
+            <w:tcW w:type="dxa" w:w="2050"/>
+            <w:tcMar>
+              <w:top w:w="80" w:type="dxa"/>
+              <w:start w:w="120" w:type="dxa"/>
+              <w:bottom w:w="80" w:type="dxa"/>
+              <w:end w:w="120" w:type="dxa"/>
+            </w:tcMar>
+            <w:vAlign w:val="center"/>
+          </w:tcPr>
+          <w:p>
+            <w:pPr>
+              <w:spacing w:before="0" w:after="0" w:line="240" w:lineRule="auto"/>
+            </w:pPr>
+            <w:r>
+              <w:rPr>
+                <w:rFonts w:ascii="Calibri" w:hAnsi="Calibri"/>
+                <w:b w:val="0"/>
+                <w:sz w:val="19"/>
+              </w:rPr>
+            </w:r>
+            <w:r>
+              <w:rPr>
+                <w:rFonts w:ascii="Calibri" w:hAnsi="Calibri"/>
+                <w:b w:val="0"/>
+                <w:sz w:val="19"/>
+              </w:rPr>
+              <w:t>42.5 / 53.9</w:t>
+            </w:r>
+          </w:p>
+        </w:tc>
+        <w:tc>
+          <w:tcPr>
+            <w:tcW w:type="dxa" w:w="1660"/>
+            <w:tcMar>
+              <w:top w:w="80" w:type="dxa"/>
+              <w:start w:w="120" w:type="dxa"/>
+              <w:bottom w:w="80" w:type="dxa"/>
+              <w:end w:w="120" w:type="dxa"/>
+            </w:tcMar>
+            <w:vAlign w:val="center"/>
+          </w:tcPr>
+          <w:p>
+            <w:pPr>
+              <w:spacing w:before="0" w:after="0" w:line="240" w:lineRule="auto"/>
+            </w:pPr>
+            <w:r>
+              <w:rPr>
+                <w:rFonts w:ascii="Calibri" w:hAnsi="Calibri"/>
+                <w:b w:val="0"/>
+                <w:sz w:val="19"/>
+              </w:rPr>
+            </w:r>
+            <w:r>
+              <w:rPr>
+                <w:rFonts w:ascii="Calibri" w:hAnsi="Calibri"/>
+                <w:b w:val="0"/>
+                <w:sz w:val="19"/>
+              </w:rPr>
+              <w:t>RNA + V(D)J</w:t>
+            </w:r>
+          </w:p>
+        </w:tc>
+      </w:tr>
+      <w:tr>
+        <w:trPr>
+          <w:cantSplit/>
+        </w:trPr>
+        <w:tc>
+          <w:tcPr>
+            <w:tcW w:type="dxa" w:w="950"/>
+            <w:tcMar>
+              <w:top w:w="80" w:type="dxa"/>
+              <w:start w:w="120" w:type="dxa"/>
+              <w:bottom w:w="80" w:type="dxa"/>
+              <w:end w:w="120" w:type="dxa"/>
+            </w:tcMar>
+            <w:vAlign w:val="center"/>
+          </w:tcPr>
+          <w:p>
+            <w:pPr>
+              <w:spacing w:before="0" w:after="0" w:line="240" w:lineRule="auto"/>
+            </w:pPr>
+            <w:r>
+              <w:rPr>
+                <w:rFonts w:ascii="Calibri" w:hAnsi="Calibri"/>
+                <w:b w:val="0"/>
+                <w:sz w:val="19"/>
+              </w:rPr>
+            </w:r>
+            <w:r>
+              <w:rPr>
+                <w:rFonts w:ascii="Calibri" w:hAnsi="Calibri"/>
+                <w:b w:val="0"/>
+                <w:sz w:val="19"/>
+              </w:rPr>
+              <w:t>Patient 2</w:t>
+            </w:r>
+          </w:p>
+        </w:tc>
+        <w:tc>
+          <w:tcPr>
+            <w:tcW w:type="dxa" w:w="1600"/>
+            <w:tcMar>
+              <w:top w:w="80" w:type="dxa"/>
+              <w:start w:w="120" w:type="dxa"/>
+              <w:bottom w:w="80" w:type="dxa"/>
+              <w:end w:w="120" w:type="dxa"/>
+            </w:tcMar>
+            <w:vAlign w:val="center"/>
+          </w:tcPr>
+          <w:p>
+            <w:pPr>
+              <w:spacing w:before="0" w:after="0" w:line="240" w:lineRule="auto"/>
+            </w:pPr>
+            <w:r>
+              <w:rPr>
+                <w:rFonts w:ascii="Calibri" w:hAnsi="Calibri"/>
+                <w:b w:val="0"/>
+                <w:sz w:val="19"/>
+              </w:rPr>
+            </w:r>
+            <w:r>
+              <w:rPr>
+                <w:rFonts w:ascii="Calibri" w:hAnsi="Calibri"/>
+                <w:b w:val="0"/>
+                <w:sz w:val="19"/>
+              </w:rPr>
+              <w:t>Responder</w:t>
+            </w:r>
+          </w:p>
+        </w:tc>
+        <w:tc>
+          <w:tcPr>
+            <w:tcW w:type="dxa" w:w="1450"/>
+            <w:tcMar>
+              <w:top w:w="80" w:type="dxa"/>
+              <w:start w:w="120" w:type="dxa"/>
+              <w:bottom w:w="80" w:type="dxa"/>
+              <w:end w:w="120" w:type="dxa"/>
+            </w:tcMar>
+            <w:vAlign w:val="center"/>
+          </w:tcPr>
+          <w:p>
+            <w:pPr>
+              <w:spacing w:before="0" w:after="0" w:line="240" w:lineRule="auto"/>
+            </w:pPr>
+            <w:r>
+              <w:rPr>
+                <w:rFonts w:ascii="Calibri" w:hAnsi="Calibri"/>
+                <w:b w:val="0"/>
+                <w:sz w:val="19"/>
+              </w:rPr>
+            </w:r>
+            <w:r>
+              <w:rPr>
+                <w:rFonts w:ascii="Calibri" w:hAnsi="Calibri"/>
+                <w:b w:val="0"/>
+                <w:sz w:val="19"/>
+              </w:rPr>
+              <w:t>Baseline</w:t>
+            </w:r>
+          </w:p>
+        </w:tc>
+        <w:tc>
+          <w:tcPr>
+            <w:tcW w:type="dxa" w:w="850"/>
+            <w:tcMar>
+              <w:top w:w="80" w:type="dxa"/>
+              <w:start w:w="120" w:type="dxa"/>
+              <w:bottom w:w="80" w:type="dxa"/>
+              <w:end w:w="120" w:type="dxa"/>
+            </w:tcMar>
+            <w:vAlign w:val="center"/>
+          </w:tcPr>
+          <w:p>
+            <w:pPr>
+              <w:spacing w:before="0" w:after="0" w:line="240" w:lineRule="auto"/>
+            </w:pPr>
+            <w:r>
+              <w:rPr>
+                <w:rFonts w:ascii="Calibri" w:hAnsi="Calibri"/>
+                <w:b w:val="0"/>
+                <w:sz w:val="19"/>
+              </w:rPr>
+            </w:r>
+            <w:r>
+              <w:rPr>
+                <w:rFonts w:ascii="Calibri" w:hAnsi="Calibri"/>
+                <w:b w:val="0"/>
+                <w:sz w:val="19"/>
+              </w:rPr>
+              <w:t>S4</w:t>
+            </w:r>
+          </w:p>
+        </w:tc>
+        <w:tc>
+          <w:tcPr>
+            <w:tcW w:type="dxa" w:w="800"/>
+            <w:tcMar>
+              <w:top w:w="80" w:type="dxa"/>
+              <w:start w:w="120" w:type="dxa"/>
+              <w:bottom w:w="80" w:type="dxa"/>
+              <w:end w:w="120" w:type="dxa"/>
+            </w:tcMar>
+            <w:vAlign w:val="center"/>
+          </w:tcPr>
+          <w:p>
+            <w:pPr>
+              <w:spacing w:before="0" w:after="0" w:line="240" w:lineRule="auto"/>
+              <w:jc w:val="center"/>
+            </w:pPr>
+            <w:r>
+              <w:rPr>
+                <w:rFonts w:ascii="Calibri" w:hAnsi="Calibri"/>
+                <w:b w:val="0"/>
+                <w:sz w:val="19"/>
+              </w:rPr>
+            </w:r>
+            <w:r>
+              <w:rPr>
+                <w:rFonts w:ascii="Calibri" w:hAnsi="Calibri"/>
+                <w:b w:val="0"/>
+                <w:sz w:val="19"/>
+              </w:rPr>
+              <w:t>8723</w:t>
+            </w:r>
+          </w:p>
+        </w:tc>
+        <w:tc>
+          <w:tcPr>
+            <w:tcW w:type="dxa" w:w="2050"/>
+            <w:tcMar>
+              <w:top w:w="80" w:type="dxa"/>
+              <w:start w:w="120" w:type="dxa"/>
+              <w:bottom w:w="80" w:type="dxa"/>
+              <w:end w:w="120" w:type="dxa"/>
+            </w:tcMar>
+            <w:vAlign w:val="center"/>
+          </w:tcPr>
+          <w:p>
+            <w:pPr>
+              <w:spacing w:before="0" w:after="0" w:line="240" w:lineRule="auto"/>
+            </w:pPr>
+            <w:r>
+              <w:rPr>
+                <w:rFonts w:ascii="Calibri" w:hAnsi="Calibri"/>
+                <w:b w:val="0"/>
+                <w:sz w:val="19"/>
+              </w:rPr>
+            </w:r>
+            <w:r>
+              <w:rPr>
+                <w:rFonts w:ascii="Calibri" w:hAnsi="Calibri"/>
+                <w:b w:val="0"/>
+                <w:sz w:val="19"/>
+              </w:rPr>
+              <w:t>28.3 / 33.9</w:t>
+            </w:r>
+          </w:p>
+        </w:tc>
+        <w:tc>
+          <w:tcPr>
+            <w:tcW w:type="dxa" w:w="1660"/>
+            <w:tcMar>
+              <w:top w:w="80" w:type="dxa"/>
+              <w:start w:w="120" w:type="dxa"/>
+              <w:bottom w:w="80" w:type="dxa"/>
+              <w:end w:w="120" w:type="dxa"/>
+            </w:tcMar>
+            <w:vAlign w:val="center"/>
+          </w:tcPr>
+          <w:p>
+            <w:pPr>
+              <w:spacing w:before="0" w:after="0" w:line="240" w:lineRule="auto"/>
+            </w:pPr>
+            <w:r>
+              <w:rPr>
+                <w:rFonts w:ascii="Calibri" w:hAnsi="Calibri"/>
+                <w:b w:val="0"/>
+                <w:sz w:val="19"/>
+              </w:rPr>
+            </w:r>
+            <w:r>
+              <w:rPr>
+                <w:rFonts w:ascii="Calibri" w:hAnsi="Calibri"/>
+                <w:b w:val="0"/>
+                <w:sz w:val="19"/>
+              </w:rPr>
+              <w:t>RNA + V(D)J</w:t>
+            </w:r>
+          </w:p>
+        </w:tc>
+      </w:tr>
+      <w:tr>
+        <w:trPr>
+          <w:cantSplit/>
+        </w:trPr>
+        <w:tc>
+          <w:tcPr>
+            <w:tcW w:type="dxa" w:w="950"/>
+            <w:tcMar>
+              <w:top w:w="80" w:type="dxa"/>
+              <w:start w:w="120" w:type="dxa"/>
+              <w:bottom w:w="80" w:type="dxa"/>
+              <w:end w:w="120" w:type="dxa"/>
+            </w:tcMar>
+            <w:vAlign w:val="center"/>
+          </w:tcPr>
+          <w:p>
+            <w:pPr>
+              <w:spacing w:before="0" w:after="0" w:line="240" w:lineRule="auto"/>
+            </w:pPr>
+            <w:r>
+              <w:rPr>
+                <w:rFonts w:ascii="Calibri" w:hAnsi="Calibri"/>
+                <w:b w:val="0"/>
+                <w:sz w:val="19"/>
+              </w:rPr>
+            </w:r>
+            <w:r>
+              <w:rPr>
+                <w:rFonts w:ascii="Calibri" w:hAnsi="Calibri"/>
+                <w:b w:val="0"/>
+                <w:sz w:val="19"/>
+              </w:rPr>
+              <w:t>Patient 2</w:t>
+            </w:r>
+          </w:p>
+        </w:tc>
+        <w:tc>
+          <w:tcPr>
+            <w:tcW w:type="dxa" w:w="1600"/>
+            <w:tcMar>
+              <w:top w:w="80" w:type="dxa"/>
+              <w:start w:w="120" w:type="dxa"/>
+              <w:bottom w:w="80" w:type="dxa"/>
+              <w:end w:w="120" w:type="dxa"/>
+            </w:tcMar>
+            <w:vAlign w:val="center"/>
+          </w:tcPr>
+          <w:p>
+            <w:pPr>
+              <w:spacing w:before="0" w:after="0" w:line="240" w:lineRule="auto"/>
+            </w:pPr>
+            <w:r>
+              <w:rPr>
+                <w:rFonts w:ascii="Calibri" w:hAnsi="Calibri"/>
+                <w:b w:val="0"/>
+                <w:sz w:val="19"/>
+              </w:rPr>
+            </w:r>
+            <w:r>
+              <w:rPr>
+                <w:rFonts w:ascii="Calibri" w:hAnsi="Calibri"/>
+                <w:b w:val="0"/>
+                <w:sz w:val="19"/>
+              </w:rPr>
+              <w:t>Responder</w:t>
+            </w:r>
+          </w:p>
+        </w:tc>
+        <w:tc>
+          <w:tcPr>
+            <w:tcW w:type="dxa" w:w="1450"/>
+            <w:tcMar>
+              <w:top w:w="80" w:type="dxa"/>
+              <w:start w:w="120" w:type="dxa"/>
+              <w:bottom w:w="80" w:type="dxa"/>
+              <w:end w:w="120" w:type="dxa"/>
+            </w:tcMar>
+            <w:vAlign w:val="center"/>
+          </w:tcPr>
+          <w:p>
+            <w:pPr>
+              <w:spacing w:before="0" w:after="0" w:line="240" w:lineRule="auto"/>
+            </w:pPr>
+            <w:r>
+              <w:rPr>
+                <w:rFonts w:ascii="Calibri" w:hAnsi="Calibri"/>
+                <w:b w:val="0"/>
+                <w:sz w:val="19"/>
+              </w:rPr>
+            </w:r>
+            <w:r>
+              <w:rPr>
+                <w:rFonts w:ascii="Calibri" w:hAnsi="Calibri"/>
+                <w:b w:val="0"/>
+                <w:sz w:val="19"/>
+              </w:rPr>
+              <w:t>Post-treatment</w:t>
+            </w:r>
+          </w:p>
+        </w:tc>
+        <w:tc>
+          <w:tcPr>
+            <w:tcW w:type="dxa" w:w="850"/>
+            <w:tcMar>
+              <w:top w:w="80" w:type="dxa"/>
+              <w:start w:w="120" w:type="dxa"/>
+              <w:bottom w:w="80" w:type="dxa"/>
+              <w:end w:w="120" w:type="dxa"/>
+            </w:tcMar>
+            <w:vAlign w:val="center"/>
+          </w:tcPr>
+          <w:p>
+            <w:pPr>
+              <w:spacing w:before="0" w:after="0" w:line="240" w:lineRule="auto"/>
+            </w:pPr>
+            <w:r>
+              <w:rPr>
+                <w:rFonts w:ascii="Calibri" w:hAnsi="Calibri"/>
+                <w:b w:val="0"/>
+                <w:sz w:val="19"/>
+              </w:rPr>
+            </w:r>
+            <w:r>
+              <w:rPr>
+                <w:rFonts w:ascii="Calibri" w:hAnsi="Calibri"/>
+                <w:b w:val="0"/>
+                <w:sz w:val="19"/>
+              </w:rPr>
+              <w:t>S5</w:t>
+            </w:r>
+          </w:p>
+        </w:tc>
+        <w:tc>
+          <w:tcPr>
+            <w:tcW w:type="dxa" w:w="800"/>
+            <w:tcMar>
+              <w:top w:w="80" w:type="dxa"/>
+              <w:start w:w="120" w:type="dxa"/>
+              <w:bottom w:w="80" w:type="dxa"/>
+              <w:end w:w="120" w:type="dxa"/>
+            </w:tcMar>
+            <w:vAlign w:val="center"/>
+          </w:tcPr>
+          <w:p>
+            <w:pPr>
+              <w:spacing w:before="0" w:after="0" w:line="240" w:lineRule="auto"/>
+              <w:jc w:val="center"/>
+            </w:pPr>
+            <w:r>
+              <w:rPr>
+                <w:rFonts w:ascii="Calibri" w:hAnsi="Calibri"/>
+                <w:b w:val="0"/>
+                <w:sz w:val="19"/>
+              </w:rPr>
+            </w:r>
+            <w:r>
+              <w:rPr>
+                <w:rFonts w:ascii="Calibri" w:hAnsi="Calibri"/>
+                <w:b w:val="0"/>
+                <w:sz w:val="19"/>
+              </w:rPr>
+              <w:t>2912</w:t>
+            </w:r>
+          </w:p>
+        </w:tc>
+        <w:tc>
+          <w:tcPr>
+            <w:tcW w:type="dxa" w:w="2050"/>
+            <w:tcMar>
+              <w:top w:w="80" w:type="dxa"/>
+              <w:start w:w="120" w:type="dxa"/>
+              <w:bottom w:w="80" w:type="dxa"/>
+              <w:end w:w="120" w:type="dxa"/>
+            </w:tcMar>
+            <w:vAlign w:val="center"/>
+          </w:tcPr>
+          <w:p>
+            <w:pPr>
+              <w:spacing w:before="0" w:after="0" w:line="240" w:lineRule="auto"/>
+            </w:pPr>
+            <w:r>
+              <w:rPr>
+                <w:rFonts w:ascii="Calibri" w:hAnsi="Calibri"/>
+                <w:b w:val="0"/>
+                <w:sz w:val="19"/>
+              </w:rPr>
+            </w:r>
+            <w:r>
+              <w:rPr>
+                <w:rFonts w:ascii="Calibri" w:hAnsi="Calibri"/>
+                <w:b w:val="0"/>
+                <w:sz w:val="19"/>
+              </w:rPr>
+              <w:t>31.4 / 41.0</w:t>
+            </w:r>
+          </w:p>
+        </w:tc>
+        <w:tc>
+          <w:tcPr>
+            <w:tcW w:type="dxa" w:w="1660"/>
+            <w:tcMar>
+              <w:top w:w="80" w:type="dxa"/>
+              <w:start w:w="120" w:type="dxa"/>
+              <w:bottom w:w="80" w:type="dxa"/>
+              <w:end w:w="120" w:type="dxa"/>
+            </w:tcMar>
+            <w:vAlign w:val="center"/>
+          </w:tcPr>
+          <w:p>
+            <w:pPr>
+              <w:spacing w:before="0" w:after="0" w:line="240" w:lineRule="auto"/>
+            </w:pPr>
+            <w:r>
+              <w:rPr>
+                <w:rFonts w:ascii="Calibri" w:hAnsi="Calibri"/>
+                <w:b w:val="0"/>
+                <w:sz w:val="19"/>
+              </w:rPr>
+            </w:r>
+            <w:r>
+              <w:rPr>
+                <w:rFonts w:ascii="Calibri" w:hAnsi="Calibri"/>
+                <w:b w:val="0"/>
+                <w:sz w:val="19"/>
+              </w:rPr>
+              <w:t>RNA + V(D)J</w:t>
+            </w:r>
+          </w:p>
+        </w:tc>
+      </w:tr>
+      <w:tr>
+        <w:trPr>
+          <w:cantSplit/>
+        </w:trPr>
+        <w:tc>
+          <w:tcPr>
+            <w:tcW w:type="dxa" w:w="950"/>
+            <w:tcMar>
+              <w:top w:w="80" w:type="dxa"/>
+              <w:start w:w="120" w:type="dxa"/>
+              <w:bottom w:w="80" w:type="dxa"/>
+              <w:end w:w="120" w:type="dxa"/>
+            </w:tcMar>
+            <w:vAlign w:val="center"/>
+          </w:tcPr>
+          <w:p>
+            <w:pPr>
+              <w:spacing w:before="0" w:after="0" w:line="240" w:lineRule="auto"/>
+            </w:pPr>
+            <w:r>
+              <w:rPr>
+                <w:rFonts w:ascii="Calibri" w:hAnsi="Calibri"/>
+                <w:b w:val="0"/>
+                <w:sz w:val="19"/>
+              </w:rPr>
+            </w:r>
+            <w:r>
+              <w:rPr>
+                <w:rFonts w:ascii="Calibri" w:hAnsi="Calibri"/>
+                <w:b w:val="0"/>
+                <w:sz w:val="19"/>
+              </w:rPr>
+              <w:t>Patient 3</w:t>
+            </w:r>
+          </w:p>
+        </w:tc>
+        <w:tc>
+          <w:tcPr>
+            <w:tcW w:type="dxa" w:w="1600"/>
+            <w:tcMar>
+              <w:top w:w="80" w:type="dxa"/>
+              <w:start w:w="120" w:type="dxa"/>
+              <w:bottom w:w="80" w:type="dxa"/>
+              <w:end w:w="120" w:type="dxa"/>
+            </w:tcMar>
+            <w:vAlign w:val="center"/>
+          </w:tcPr>
+          <w:p>
+            <w:pPr>
+              <w:spacing w:before="0" w:after="0" w:line="240" w:lineRule="auto"/>
+            </w:pPr>
+            <w:r>
+              <w:rPr>
+                <w:rFonts w:ascii="Calibri" w:hAnsi="Calibri"/>
+                <w:b w:val="0"/>
+                <w:sz w:val="19"/>
+              </w:rPr>
+            </w:r>
+            <w:r>
+              <w:rPr>
+                <w:rFonts w:ascii="Calibri" w:hAnsi="Calibri"/>
+                <w:b w:val="0"/>
+                <w:sz w:val="19"/>
+              </w:rPr>
+              <w:t>Nonresponder</w:t>
+            </w:r>
+          </w:p>
+        </w:tc>
+        <w:tc>
+          <w:tcPr>
+            <w:tcW w:type="dxa" w:w="1450"/>
+            <w:tcMar>
+              <w:top w:w="80" w:type="dxa"/>
+              <w:start w:w="120" w:type="dxa"/>
+              <w:bottom w:w="80" w:type="dxa"/>
+              <w:end w:w="120" w:type="dxa"/>
+            </w:tcMar>
+            <w:vAlign w:val="center"/>
+          </w:tcPr>
+          <w:p>
+            <w:pPr>
+              <w:spacing w:before="0" w:after="0" w:line="240" w:lineRule="auto"/>
+            </w:pPr>
+            <w:r>
+              <w:rPr>
+                <w:rFonts w:ascii="Calibri" w:hAnsi="Calibri"/>
+                <w:b w:val="0"/>
+                <w:sz w:val="19"/>
+              </w:rPr>
+            </w:r>
+            <w:r>
+              <w:rPr>
+                <w:rFonts w:ascii="Calibri" w:hAnsi="Calibri"/>
+                <w:b w:val="0"/>
+                <w:sz w:val="19"/>
+              </w:rPr>
+              <w:t>Baseline</w:t>
+            </w:r>
+          </w:p>
+        </w:tc>
+        <w:tc>
+          <w:tcPr>
+            <w:tcW w:type="dxa" w:w="850"/>
+            <w:tcMar>
+              <w:top w:w="80" w:type="dxa"/>
+              <w:start w:w="120" w:type="dxa"/>
+              <w:bottom w:w="80" w:type="dxa"/>
+              <w:end w:w="120" w:type="dxa"/>
+            </w:tcMar>
+            <w:vAlign w:val="center"/>
+          </w:tcPr>
+          <w:p>
+            <w:pPr>
+              <w:spacing w:before="0" w:after="0" w:line="240" w:lineRule="auto"/>
+            </w:pPr>
+            <w:r>
+              <w:rPr>
+                <w:rFonts w:ascii="Calibri" w:hAnsi="Calibri"/>
+                <w:b w:val="0"/>
+                <w:sz w:val="19"/>
+              </w:rPr>
+            </w:r>
+            <w:r>
+              <w:rPr>
+                <w:rFonts w:ascii="Calibri" w:hAnsi="Calibri"/>
+                <w:b w:val="0"/>
+                <w:sz w:val="19"/>
+              </w:rPr>
+              <w:t>S6</w:t>
+            </w:r>
+          </w:p>
+        </w:tc>
+        <w:tc>
+          <w:tcPr>
+            <w:tcW w:type="dxa" w:w="800"/>
+            <w:tcMar>
+              <w:top w:w="80" w:type="dxa"/>
+              <w:start w:w="120" w:type="dxa"/>
+              <w:bottom w:w="80" w:type="dxa"/>
+              <w:end w:w="120" w:type="dxa"/>
+            </w:tcMar>
+            <w:vAlign w:val="center"/>
+          </w:tcPr>
+          <w:p>
+            <w:pPr>
+              <w:spacing w:before="0" w:after="0" w:line="240" w:lineRule="auto"/>
+              <w:jc w:val="center"/>
+            </w:pPr>
+            <w:r>
+              <w:rPr>
+                <w:rFonts w:ascii="Calibri" w:hAnsi="Calibri"/>
+                <w:b w:val="0"/>
+                <w:sz w:val="19"/>
+              </w:rPr>
+            </w:r>
+            <w:r>
+              <w:rPr>
+                <w:rFonts w:ascii="Calibri" w:hAnsi="Calibri"/>
+                <w:b w:val="0"/>
+                <w:sz w:val="19"/>
+              </w:rPr>
+              <w:t>10398</w:t>
+            </w:r>
+          </w:p>
+        </w:tc>
+        <w:tc>
+          <w:tcPr>
+            <w:tcW w:type="dxa" w:w="2050"/>
+            <w:tcMar>
+              <w:top w:w="80" w:type="dxa"/>
+              <w:start w:w="120" w:type="dxa"/>
+              <w:bottom w:w="80" w:type="dxa"/>
+              <w:end w:w="120" w:type="dxa"/>
+            </w:tcMar>
+            <w:vAlign w:val="center"/>
+          </w:tcPr>
+          <w:p>
+            <w:pPr>
+              <w:spacing w:before="0" w:after="0" w:line="240" w:lineRule="auto"/>
+            </w:pPr>
+            <w:r>
+              <w:rPr>
+                <w:rFonts w:ascii="Calibri" w:hAnsi="Calibri"/>
+                <w:b w:val="0"/>
+                <w:sz w:val="19"/>
+              </w:rPr>
+            </w:r>
+            <w:r>
+              <w:rPr>
+                <w:rFonts w:ascii="Calibri" w:hAnsi="Calibri"/>
+                <w:b w:val="0"/>
+                <w:sz w:val="19"/>
+              </w:rPr>
+              <w:t>51.1 / 55.0</w:t>
+            </w:r>
+          </w:p>
+        </w:tc>
+        <w:tc>
+          <w:tcPr>
+            <w:tcW w:type="dxa" w:w="1660"/>
+            <w:tcMar>
+              <w:top w:w="80" w:type="dxa"/>
+              <w:start w:w="120" w:type="dxa"/>
+              <w:bottom w:w="80" w:type="dxa"/>
+              <w:end w:w="120" w:type="dxa"/>
+            </w:tcMar>
+            <w:vAlign w:val="center"/>
+          </w:tcPr>
+          <w:p>
+            <w:pPr>
+              <w:spacing w:before="0" w:after="0" w:line="240" w:lineRule="auto"/>
+            </w:pPr>
+            <w:r>
+              <w:rPr>
+                <w:rFonts w:ascii="Calibri" w:hAnsi="Calibri"/>
+                <w:b w:val="0"/>
+                <w:sz w:val="19"/>
+              </w:rPr>
+            </w:r>
+            <w:r>
+              <w:rPr>
+                <w:rFonts w:ascii="Calibri" w:hAnsi="Calibri"/>
+                <w:b w:val="0"/>
+                <w:sz w:val="19"/>
+              </w:rPr>
+              <w:t>RNA + V(D)J</w:t>
+            </w:r>
+          </w:p>
+        </w:tc>
+      </w:tr>
+      <w:tr>
+        <w:trPr>
+          <w:cantSplit/>
+        </w:trPr>
+        <w:tc>
+          <w:tcPr>
+            <w:tcW w:type="dxa" w:w="950"/>
+            <w:tcMar>
+              <w:top w:w="80" w:type="dxa"/>
+              <w:start w:w="120" w:type="dxa"/>
+              <w:bottom w:w="80" w:type="dxa"/>
+              <w:end w:w="120" w:type="dxa"/>
+            </w:tcMar>
+            <w:vAlign w:val="center"/>
+          </w:tcPr>
+          <w:p>
+            <w:pPr>
+              <w:spacing w:before="0" w:after="0" w:line="240" w:lineRule="auto"/>
+            </w:pPr>
+            <w:r>
+              <w:rPr>
+                <w:rFonts w:ascii="Calibri" w:hAnsi="Calibri"/>
+                <w:b w:val="0"/>
+                <w:sz w:val="19"/>
+              </w:rPr>
+            </w:r>
+            <w:r>
+              <w:rPr>
+                <w:rFonts w:ascii="Calibri" w:hAnsi="Calibri"/>
+                <w:b w:val="0"/>
+                <w:sz w:val="19"/>
+              </w:rPr>
+              <w:t>Patient 3</w:t>
+            </w:r>
+          </w:p>
+        </w:tc>
+        <w:tc>
+          <w:tcPr>
+            <w:tcW w:type="dxa" w:w="1600"/>
+            <w:tcMar>
+              <w:top w:w="80" w:type="dxa"/>
+              <w:start w:w="120" w:type="dxa"/>
+              <w:bottom w:w="80" w:type="dxa"/>
+              <w:end w:w="120" w:type="dxa"/>
+            </w:tcMar>
+            <w:vAlign w:val="center"/>
+          </w:tcPr>
+          <w:p>
+            <w:pPr>
+              <w:spacing w:before="0" w:after="0" w:line="240" w:lineRule="auto"/>
+            </w:pPr>
+            <w:r>
+              <w:rPr>
+                <w:rFonts w:ascii="Calibri" w:hAnsi="Calibri"/>
+                <w:b w:val="0"/>
+                <w:sz w:val="19"/>
+              </w:rPr>
+            </w:r>
+            <w:r>
+              <w:rPr>
+                <w:rFonts w:ascii="Calibri" w:hAnsi="Calibri"/>
+                <w:b w:val="0"/>
+                <w:sz w:val="19"/>
+              </w:rPr>
+              <w:t>Nonresponder</w:t>
+            </w:r>
+          </w:p>
+        </w:tc>
+        <w:tc>
+          <w:tcPr>
+            <w:tcW w:type="dxa" w:w="1450"/>
+            <w:tcMar>
+              <w:top w:w="80" w:type="dxa"/>
+              <w:start w:w="120" w:type="dxa"/>
+              <w:bottom w:w="80" w:type="dxa"/>
+              <w:end w:w="120" w:type="dxa"/>
+            </w:tcMar>
+            <w:vAlign w:val="center"/>
+          </w:tcPr>
+          <w:p>
+            <w:pPr>
+              <w:spacing w:before="0" w:after="0" w:line="240" w:lineRule="auto"/>
+            </w:pPr>
+            <w:r>
+              <w:rPr>
+                <w:rFonts w:ascii="Calibri" w:hAnsi="Calibri"/>
+                <w:b w:val="0"/>
+                <w:sz w:val="19"/>
+              </w:rPr>
+            </w:r>
+            <w:r>
+              <w:rPr>
+                <w:rFonts w:ascii="Calibri" w:hAnsi="Calibri"/>
+                <w:b w:val="0"/>
+                <w:sz w:val="19"/>
+              </w:rPr>
+              <w:t>Post-treatment</w:t>
+            </w:r>
+          </w:p>
+        </w:tc>
+        <w:tc>
+          <w:tcPr>
+            <w:tcW w:type="dxa" w:w="850"/>
+            <w:tcMar>
+              <w:top w:w="80" w:type="dxa"/>
+              <w:start w:w="120" w:type="dxa"/>
+              <w:bottom w:w="80" w:type="dxa"/>
+              <w:end w:w="120" w:type="dxa"/>
+            </w:tcMar>
+            <w:vAlign w:val="center"/>
+          </w:tcPr>
+          <w:p>
+            <w:pPr>
+              <w:spacing w:before="0" w:after="0" w:line="240" w:lineRule="auto"/>
+            </w:pPr>
+            <w:r>
+              <w:rPr>
+                <w:rFonts w:ascii="Calibri" w:hAnsi="Calibri"/>
+                <w:b w:val="0"/>
+                <w:sz w:val="19"/>
+              </w:rPr>
+            </w:r>
+            <w:r>
+              <w:rPr>
+                <w:rFonts w:ascii="Calibri" w:hAnsi="Calibri"/>
+                <w:b w:val="0"/>
+                <w:sz w:val="19"/>
+              </w:rPr>
+              <w:t>S7</w:t>
+            </w:r>
+          </w:p>
+        </w:tc>
+        <w:tc>
+          <w:tcPr>
+            <w:tcW w:type="dxa" w:w="800"/>
+            <w:tcMar>
+              <w:top w:w="80" w:type="dxa"/>
+              <w:start w:w="120" w:type="dxa"/>
+              <w:bottom w:w="80" w:type="dxa"/>
+              <w:end w:w="120" w:type="dxa"/>
+            </w:tcMar>
+            <w:vAlign w:val="center"/>
+          </w:tcPr>
+          <w:p>
+            <w:pPr>
+              <w:spacing w:before="0" w:after="0" w:line="240" w:lineRule="auto"/>
+              <w:jc w:val="center"/>
+            </w:pPr>
+            <w:r>
+              <w:rPr>
+                <w:rFonts w:ascii="Calibri" w:hAnsi="Calibri"/>
+                <w:b w:val="0"/>
+                <w:sz w:val="19"/>
+              </w:rPr>
+            </w:r>
+            <w:r>
+              <w:rPr>
+                <w:rFonts w:ascii="Calibri" w:hAnsi="Calibri"/>
+                <w:b w:val="0"/>
+                <w:sz w:val="19"/>
+              </w:rPr>
+              <w:t>9330</w:t>
+            </w:r>
+          </w:p>
+        </w:tc>
+        <w:tc>
+          <w:tcPr>
+            <w:tcW w:type="dxa" w:w="2050"/>
+            <w:tcMar>
+              <w:top w:w="80" w:type="dxa"/>
+              <w:start w:w="120" w:type="dxa"/>
+              <w:bottom w:w="80" w:type="dxa"/>
+              <w:end w:w="120" w:type="dxa"/>
+            </w:tcMar>
+            <w:vAlign w:val="center"/>
+          </w:tcPr>
+          <w:p>
+            <w:pPr>
+              <w:spacing w:before="0" w:after="0" w:line="240" w:lineRule="auto"/>
+            </w:pPr>
+            <w:r>
+              <w:rPr>
+                <w:rFonts w:ascii="Calibri" w:hAnsi="Calibri"/>
+                <w:b w:val="0"/>
+                <w:sz w:val="19"/>
+              </w:rPr>
+            </w:r>
+            <w:r>
+              <w:rPr>
+                <w:rFonts w:ascii="Calibri" w:hAnsi="Calibri"/>
+                <w:b w:val="0"/>
+                <w:sz w:val="19"/>
+              </w:rPr>
+              <w:t>51.9 / 57.3</w:t>
+            </w:r>
+          </w:p>
+        </w:tc>
+        <w:tc>
+          <w:tcPr>
+            <w:tcW w:type="dxa" w:w="1660"/>
+            <w:tcMar>
+              <w:top w:w="80" w:type="dxa"/>
+              <w:start w:w="120" w:type="dxa"/>
+              <w:bottom w:w="80" w:type="dxa"/>
+              <w:end w:w="120" w:type="dxa"/>
+            </w:tcMar>
+            <w:vAlign w:val="center"/>
+          </w:tcPr>
+          <w:p>
+            <w:pPr>
+              <w:spacing w:before="0" w:after="0" w:line="240" w:lineRule="auto"/>
+            </w:pPr>
+            <w:r>
+              <w:rPr>
+                <w:rFonts w:ascii="Calibri" w:hAnsi="Calibri"/>
+                <w:b w:val="0"/>
+                <w:sz w:val="19"/>
+              </w:rPr>
+            </w:r>
+            <w:r>
+              <w:rPr>
+                <w:rFonts w:ascii="Calibri" w:hAnsi="Calibri"/>
+                <w:b w:val="0"/>
+                <w:sz w:val="19"/>
+              </w:rPr>
+              <w:t>RNA + V(D)J</w:t>
+            </w:r>
+          </w:p>
+        </w:tc>
+      </w:tr>
+      <w:tr>
+        <w:trPr>
+          <w:cantSplit/>
+        </w:trPr>
+        <w:tc>
+          <w:tcPr>
+            <w:tcW w:type="dxa" w:w="950"/>
+            <w:tcMar>
+              <w:top w:w="80" w:type="dxa"/>
+              <w:start w:w="120" w:type="dxa"/>
+              <w:bottom w:w="80" w:type="dxa"/>
+              <w:end w:w="120" w:type="dxa"/>
+            </w:tcMar>
+            <w:vAlign w:val="center"/>
+          </w:tcPr>
+          <w:p>
+            <w:pPr>
+              <w:spacing w:before="0" w:after="0" w:line="240" w:lineRule="auto"/>
+            </w:pPr>
+            <w:r>
+              <w:rPr>
+                <w:rFonts w:ascii="Calibri" w:hAnsi="Calibri"/>
+                <w:b w:val="0"/>
+                <w:sz w:val="19"/>
+              </w:rPr>
+            </w:r>
+            <w:r>
+              <w:rPr>
+                <w:rFonts w:ascii="Calibri" w:hAnsi="Calibri"/>
+                <w:b w:val="0"/>
+                <w:sz w:val="19"/>
+              </w:rPr>
+              <w:t>Patient 3</w:t>
+            </w:r>
+          </w:p>
+        </w:tc>
+        <w:tc>
+          <w:tcPr>
+            <w:tcW w:type="dxa" w:w="1600"/>
+            <w:tcMar>
+              <w:top w:w="80" w:type="dxa"/>
+              <w:start w:w="120" w:type="dxa"/>
+              <w:bottom w:w="80" w:type="dxa"/>
+              <w:end w:w="120" w:type="dxa"/>
+            </w:tcMar>
+            <w:vAlign w:val="center"/>
+          </w:tcPr>
+          <w:p>
+            <w:pPr>
+              <w:spacing w:before="0" w:after="0" w:line="240" w:lineRule="auto"/>
+            </w:pPr>
+            <w:r>
+              <w:rPr>
+                <w:rFonts w:ascii="Calibri" w:hAnsi="Calibri"/>
+                <w:b w:val="0"/>
+                <w:sz w:val="19"/>
+              </w:rPr>
+            </w:r>
+            <w:r>
+              <w:rPr>
+                <w:rFonts w:ascii="Calibri" w:hAnsi="Calibri"/>
+                <w:b w:val="0"/>
+                <w:sz w:val="19"/>
+              </w:rPr>
+              <w:t>Nonresponder</w:t>
+            </w:r>
+          </w:p>
+        </w:tc>
+        <w:tc>
+          <w:tcPr>
+            <w:tcW w:type="dxa" w:w="1450"/>
+            <w:tcMar>
+              <w:top w:w="80" w:type="dxa"/>
+              <w:start w:w="120" w:type="dxa"/>
+              <w:bottom w:w="80" w:type="dxa"/>
+              <w:end w:w="120" w:type="dxa"/>
+            </w:tcMar>
+            <w:vAlign w:val="center"/>
+          </w:tcPr>
+          <w:p>
+            <w:pPr>
+              <w:spacing w:before="0" w:after="0" w:line="240" w:lineRule="auto"/>
+            </w:pPr>
+            <w:r>
+              <w:rPr>
+                <w:rFonts w:ascii="Calibri" w:hAnsi="Calibri"/>
+                <w:b w:val="0"/>
+                <w:sz w:val="19"/>
+              </w:rPr>
+            </w:r>
+            <w:r>
+              <w:rPr>
+                <w:rFonts w:ascii="Calibri" w:hAnsi="Calibri"/>
+                <w:b w:val="0"/>
+                <w:sz w:val="19"/>
+              </w:rPr>
+              <w:t>Recurrence</w:t>
+            </w:r>
+          </w:p>
+        </w:tc>
+        <w:tc>
+          <w:tcPr>
+            <w:tcW w:type="dxa" w:w="850"/>
+            <w:tcMar>
+              <w:top w:w="80" w:type="dxa"/>
+              <w:start w:w="120" w:type="dxa"/>
+              <w:bottom w:w="80" w:type="dxa"/>
+              <w:end w:w="120" w:type="dxa"/>
+            </w:tcMar>
+            <w:vAlign w:val="center"/>
+          </w:tcPr>
+          <w:p>
+            <w:pPr>
+              <w:spacing w:before="0" w:after="0" w:line="240" w:lineRule="auto"/>
+            </w:pPr>
+            <w:r>
+              <w:rPr>
+                <w:rFonts w:ascii="Calibri" w:hAnsi="Calibri"/>
+                <w:b w:val="0"/>
+                <w:sz w:val="19"/>
+              </w:rPr>
+            </w:r>
+            <w:r>
+              <w:rPr>
+                <w:rFonts w:ascii="Calibri" w:hAnsi="Calibri"/>
+                <w:b w:val="0"/>
+                <w:sz w:val="19"/>
+              </w:rPr>
+              <w:t>S8</w:t>
+            </w:r>
+          </w:p>
+        </w:tc>
+        <w:tc>
+          <w:tcPr>
+            <w:tcW w:type="dxa" w:w="800"/>
+            <w:tcMar>
+              <w:top w:w="80" w:type="dxa"/>
+              <w:start w:w="120" w:type="dxa"/>
+              <w:bottom w:w="80" w:type="dxa"/>
+              <w:end w:w="120" w:type="dxa"/>
+            </w:tcMar>
+            <w:vAlign w:val="center"/>
+          </w:tcPr>
+          <w:p>
+            <w:pPr>
+              <w:spacing w:before="0" w:after="0" w:line="240" w:lineRule="auto"/>
+              <w:jc w:val="center"/>
+            </w:pPr>
+            <w:r>
+              <w:rPr>
+                <w:rFonts w:ascii="Calibri" w:hAnsi="Calibri"/>
+                <w:b w:val="0"/>
+                <w:sz w:val="19"/>
+              </w:rPr>
+            </w:r>
+            <w:r>
+              <w:rPr>
+                <w:rFonts w:ascii="Calibri" w:hAnsi="Calibri"/>
+                <w:b w:val="0"/>
+                <w:sz w:val="19"/>
+              </w:rPr>
+              <w:t>12832</w:t>
+            </w:r>
+          </w:p>
+        </w:tc>
+        <w:tc>
+          <w:tcPr>
+            <w:tcW w:type="dxa" w:w="2050"/>
+            <w:tcMar>
+              <w:top w:w="80" w:type="dxa"/>
+              <w:start w:w="120" w:type="dxa"/>
+              <w:bottom w:w="80" w:type="dxa"/>
+              <w:end w:w="120" w:type="dxa"/>
+            </w:tcMar>
+            <w:vAlign w:val="center"/>
+          </w:tcPr>
+          <w:p>
+            <w:pPr>
+              <w:spacing w:before="0" w:after="0" w:line="240" w:lineRule="auto"/>
+            </w:pPr>
+            <w:r>
+              <w:rPr>
+                <w:rFonts w:ascii="Calibri" w:hAnsi="Calibri"/>
+                <w:b w:val="0"/>
+                <w:sz w:val="19"/>
+              </w:rPr>
+            </w:r>
+            <w:r>
+              <w:rPr>
+                <w:rFonts w:ascii="Calibri" w:hAnsi="Calibri"/>
+                <w:b w:val="0"/>
+                <w:sz w:val="19"/>
+              </w:rPr>
+              <w:t>0.0 / 0.0</w:t>
+            </w:r>
+          </w:p>
+        </w:tc>
+        <w:tc>
+          <w:tcPr>
+            <w:tcW w:type="dxa" w:w="1660"/>
+            <w:tcMar>
+              <w:top w:w="80" w:type="dxa"/>
+              <w:start w:w="120" w:type="dxa"/>
+              <w:bottom w:w="80" w:type="dxa"/>
+              <w:end w:w="120" w:type="dxa"/>
+            </w:tcMar>
+            <w:vAlign w:val="center"/>
+          </w:tcPr>
+          <w:p>
+            <w:pPr>
+              <w:spacing w:before="0" w:after="0" w:line="240" w:lineRule="auto"/>
+            </w:pPr>
+            <w:r>
+              <w:rPr>
+                <w:rFonts w:ascii="Calibri" w:hAnsi="Calibri"/>
+                <w:b w:val="0"/>
+                <w:sz w:val="19"/>
+              </w:rPr>
+            </w:r>
+            <w:r>
+              <w:rPr>
+                <w:rFonts w:ascii="Calibri" w:hAnsi="Calibri"/>
+                <w:b w:val="0"/>
+                <w:sz w:val="19"/>
+              </w:rPr>
+              <w:t>RNA only; no V(D)J</w:t>
+            </w:r>
+          </w:p>
+        </w:tc>
+      </w:tr>
+      <w:tr>
+        <w:trPr>
+          <w:cantSplit/>
+        </w:trPr>
+        <w:tc>
+          <w:tcPr>
+            <w:tcW w:type="dxa" w:w="950"/>
+            <w:tcMar>
+              <w:top w:w="80" w:type="dxa"/>
+              <w:start w:w="120" w:type="dxa"/>
+              <w:bottom w:w="80" w:type="dxa"/>
+              <w:end w:w="120" w:type="dxa"/>
+            </w:tcMar>
+            <w:vAlign w:val="center"/>
+          </w:tcPr>
+          <w:p>
+            <w:pPr>
+              <w:spacing w:before="0" w:after="0" w:line="240" w:lineRule="auto"/>
+            </w:pPr>
+            <w:r>
+              <w:rPr>
+                <w:rFonts w:ascii="Calibri" w:hAnsi="Calibri"/>
+                <w:b w:val="0"/>
+                <w:sz w:val="19"/>
+              </w:rPr>
+            </w:r>
+            <w:r>
+              <w:rPr>
+                <w:rFonts w:ascii="Calibri" w:hAnsi="Calibri"/>
+                <w:b w:val="0"/>
+                <w:sz w:val="19"/>
+              </w:rPr>
+              <w:t>Patient 4</w:t>
+            </w:r>
+          </w:p>
+        </w:tc>
+        <w:tc>
+          <w:tcPr>
+            <w:tcW w:type="dxa" w:w="1600"/>
+            <w:tcMar>
+              <w:top w:w="80" w:type="dxa"/>
+              <w:start w:w="120" w:type="dxa"/>
+              <w:bottom w:w="80" w:type="dxa"/>
+              <w:end w:w="120" w:type="dxa"/>
+            </w:tcMar>
+            <w:vAlign w:val="center"/>
+          </w:tcPr>
+          <w:p>
+            <w:pPr>
+              <w:spacing w:before="0" w:after="0" w:line="240" w:lineRule="auto"/>
+            </w:pPr>
+            <w:r>
+              <w:rPr>
+                <w:rFonts w:ascii="Calibri" w:hAnsi="Calibri"/>
+                <w:b w:val="0"/>
+                <w:sz w:val="19"/>
+              </w:rPr>
+            </w:r>
+            <w:r>
+              <w:rPr>
+                <w:rFonts w:ascii="Calibri" w:hAnsi="Calibri"/>
+                <w:b w:val="0"/>
+                <w:sz w:val="19"/>
+              </w:rPr>
+              <w:t>Nonresponder</w:t>
+            </w:r>
+          </w:p>
+        </w:tc>
+        <w:tc>
+          <w:tcPr>
+            <w:tcW w:type="dxa" w:w="1450"/>
+            <w:tcMar>
+              <w:top w:w="80" w:type="dxa"/>
+              <w:start w:w="120" w:type="dxa"/>
+              <w:bottom w:w="80" w:type="dxa"/>
+              <w:end w:w="120" w:type="dxa"/>
+            </w:tcMar>
+            <w:vAlign w:val="center"/>
+          </w:tcPr>
+          <w:p>
+            <w:pPr>
+              <w:spacing w:before="0" w:after="0" w:line="240" w:lineRule="auto"/>
+            </w:pPr>
+            <w:r>
+              <w:rPr>
+                <w:rFonts w:ascii="Calibri" w:hAnsi="Calibri"/>
+                <w:b w:val="0"/>
+                <w:sz w:val="19"/>
+              </w:rPr>
+            </w:r>
+            <w:r>
+              <w:rPr>
+                <w:rFonts w:ascii="Calibri" w:hAnsi="Calibri"/>
+                <w:b w:val="0"/>
+                <w:sz w:val="19"/>
+              </w:rPr>
+              <w:t>Baseline</w:t>
+            </w:r>
+          </w:p>
+        </w:tc>
+        <w:tc>
+          <w:tcPr>
+            <w:tcW w:type="dxa" w:w="850"/>
+            <w:tcMar>
+              <w:top w:w="80" w:type="dxa"/>
+              <w:start w:w="120" w:type="dxa"/>
+              <w:bottom w:w="80" w:type="dxa"/>
+              <w:end w:w="120" w:type="dxa"/>
+            </w:tcMar>
+            <w:vAlign w:val="center"/>
+          </w:tcPr>
+          <w:p>
+            <w:pPr>
+              <w:spacing w:before="0" w:after="0" w:line="240" w:lineRule="auto"/>
+            </w:pPr>
+            <w:r>
+              <w:rPr>
+                <w:rFonts w:ascii="Calibri" w:hAnsi="Calibri"/>
+                <w:b w:val="0"/>
+                <w:sz w:val="19"/>
+              </w:rPr>
+            </w:r>
+            <w:r>
+              <w:rPr>
+                <w:rFonts w:ascii="Calibri" w:hAnsi="Calibri"/>
+                <w:b w:val="0"/>
+                <w:sz w:val="19"/>
+              </w:rPr>
+              <w:t>S9</w:t>
+            </w:r>
+          </w:p>
+        </w:tc>
+        <w:tc>
+          <w:tcPr>
+            <w:tcW w:type="dxa" w:w="800"/>
+            <w:tcMar>
+              <w:top w:w="80" w:type="dxa"/>
+              <w:start w:w="120" w:type="dxa"/>
+              <w:bottom w:w="80" w:type="dxa"/>
+              <w:end w:w="120" w:type="dxa"/>
+            </w:tcMar>
+            <w:vAlign w:val="center"/>
+          </w:tcPr>
+          <w:p>
+            <w:pPr>
+              <w:spacing w:before="0" w:after="0" w:line="240" w:lineRule="auto"/>
+              <w:jc w:val="center"/>
+            </w:pPr>
+            <w:r>
+              <w:rPr>
+                <w:rFonts w:ascii="Calibri" w:hAnsi="Calibri"/>
+                <w:b w:val="0"/>
+                <w:sz w:val="19"/>
+              </w:rPr>
+            </w:r>
+            <w:r>
+              <w:rPr>
+                <w:rFonts w:ascii="Calibri" w:hAnsi="Calibri"/>
+                <w:b w:val="0"/>
+                <w:sz w:val="19"/>
+              </w:rPr>
+              <w:t>11480</w:t>
+            </w:r>
+          </w:p>
+        </w:tc>
+        <w:tc>
+          <w:tcPr>
+            <w:tcW w:type="dxa" w:w="2050"/>
+            <w:tcMar>
+              <w:top w:w="80" w:type="dxa"/>
+              <w:start w:w="120" w:type="dxa"/>
+              <w:bottom w:w="80" w:type="dxa"/>
+              <w:end w:w="120" w:type="dxa"/>
+            </w:tcMar>
+            <w:vAlign w:val="center"/>
+          </w:tcPr>
+          <w:p>
+            <w:pPr>
+              <w:spacing w:before="0" w:after="0" w:line="240" w:lineRule="auto"/>
+            </w:pPr>
+            <w:r>
+              <w:rPr>
+                <w:rFonts w:ascii="Calibri" w:hAnsi="Calibri"/>
+                <w:b w:val="0"/>
+                <w:sz w:val="19"/>
+              </w:rPr>
+            </w:r>
+            <w:r>
+              <w:rPr>
+                <w:rFonts w:ascii="Calibri" w:hAnsi="Calibri"/>
+                <w:b w:val="0"/>
+                <w:sz w:val="19"/>
+              </w:rPr>
+              <w:t>43.9 / 48.9</w:t>
+            </w:r>
+          </w:p>
+        </w:tc>
+        <w:tc>
+          <w:tcPr>
+            <w:tcW w:type="dxa" w:w="1660"/>
+            <w:tcMar>
+              <w:top w:w="80" w:type="dxa"/>
+              <w:start w:w="120" w:type="dxa"/>
+              <w:bottom w:w="80" w:type="dxa"/>
+              <w:end w:w="120" w:type="dxa"/>
+            </w:tcMar>
+            <w:vAlign w:val="center"/>
+          </w:tcPr>
+          <w:p>
+            <w:pPr>
+              <w:spacing w:before="0" w:after="0" w:line="240" w:lineRule="auto"/>
+            </w:pPr>
+            <w:r>
+              <w:rPr>
+                <w:rFonts w:ascii="Calibri" w:hAnsi="Calibri"/>
+                <w:b w:val="0"/>
+                <w:sz w:val="19"/>
+              </w:rPr>
+            </w:r>
+            <w:r>
+              <w:rPr>
+                <w:rFonts w:ascii="Calibri" w:hAnsi="Calibri"/>
+                <w:b w:val="0"/>
+                <w:sz w:val="19"/>
+              </w:rPr>
+              <w:t>RNA + V(D)J</w:t>
+            </w:r>
+          </w:p>
+        </w:tc>
+      </w:tr>
+      <w:tr>
+        <w:trPr>
+          <w:cantSplit/>
+        </w:trPr>
+        <w:tc>
+          <w:tcPr>
+            <w:tcW w:type="dxa" w:w="950"/>
+            <w:tcMar>
+              <w:top w:w="80" w:type="dxa"/>
+              <w:start w:w="120" w:type="dxa"/>
+              <w:bottom w:w="80" w:type="dxa"/>
+              <w:end w:w="120" w:type="dxa"/>
+            </w:tcMar>
+            <w:vAlign w:val="center"/>
+          </w:tcPr>
+          <w:p>
+            <w:pPr>
+              <w:spacing w:before="0" w:after="0" w:line="240" w:lineRule="auto"/>
+            </w:pPr>
+            <w:r>
+              <w:rPr>
+                <w:rFonts w:ascii="Calibri" w:hAnsi="Calibri"/>
+                <w:b w:val="0"/>
+                <w:sz w:val="19"/>
+              </w:rPr>
+            </w:r>
+            <w:r>
+              <w:rPr>
+                <w:rFonts w:ascii="Calibri" w:hAnsi="Calibri"/>
+                <w:b w:val="0"/>
+                <w:sz w:val="19"/>
+              </w:rPr>
+              <w:t>Patient 4</w:t>
+            </w:r>
+          </w:p>
+        </w:tc>
+        <w:tc>
+          <w:tcPr>
+            <w:tcW w:type="dxa" w:w="1600"/>
+            <w:tcMar>
+              <w:top w:w="80" w:type="dxa"/>
+              <w:start w:w="120" w:type="dxa"/>
+              <w:bottom w:w="80" w:type="dxa"/>
+              <w:end w:w="120" w:type="dxa"/>
+            </w:tcMar>
+            <w:vAlign w:val="center"/>
+          </w:tcPr>
+          <w:p>
+            <w:pPr>
+              <w:spacing w:before="0" w:after="0" w:line="240" w:lineRule="auto"/>
+            </w:pPr>
+            <w:r>
+              <w:rPr>
+                <w:rFonts w:ascii="Calibri" w:hAnsi="Calibri"/>
+                <w:b w:val="0"/>
+                <w:sz w:val="19"/>
+              </w:rPr>
+            </w:r>
+            <w:r>
+              <w:rPr>
+                <w:rFonts w:ascii="Calibri" w:hAnsi="Calibri"/>
+                <w:b w:val="0"/>
+                <w:sz w:val="19"/>
+              </w:rPr>
+              <w:t>Nonresponder</w:t>
+            </w:r>
+          </w:p>
+        </w:tc>
+        <w:tc>
+          <w:tcPr>
+            <w:tcW w:type="dxa" w:w="1450"/>
+            <w:tcMar>
+              <w:top w:w="80" w:type="dxa"/>
+              <w:start w:w="120" w:type="dxa"/>
+              <w:bottom w:w="80" w:type="dxa"/>
+              <w:end w:w="120" w:type="dxa"/>
+            </w:tcMar>
+            <w:vAlign w:val="center"/>
+          </w:tcPr>
+          <w:p>
+            <w:pPr>
+              <w:spacing w:before="0" w:after="0" w:line="240" w:lineRule="auto"/>
+            </w:pPr>
+            <w:r>
+              <w:rPr>
+                <w:rFonts w:ascii="Calibri" w:hAnsi="Calibri"/>
+                <w:b w:val="0"/>
+                <w:sz w:val="19"/>
+              </w:rPr>
+            </w:r>
+            <w:r>
+              <w:rPr>
+                <w:rFonts w:ascii="Calibri" w:hAnsi="Calibri"/>
+                <w:b w:val="0"/>
+                <w:sz w:val="19"/>
+              </w:rPr>
+              <w:t>Post-treatment</w:t>
+            </w:r>
+          </w:p>
+        </w:tc>
+        <w:tc>
+          <w:tcPr>
+            <w:tcW w:type="dxa" w:w="850"/>
+            <w:tcMar>
+              <w:top w:w="80" w:type="dxa"/>
+              <w:start w:w="120" w:type="dxa"/>
+              <w:bottom w:w="80" w:type="dxa"/>
+              <w:end w:w="120" w:type="dxa"/>
+            </w:tcMar>
+            <w:vAlign w:val="center"/>
+          </w:tcPr>
+          <w:p>
+            <w:pPr>
+              <w:spacing w:before="0" w:after="0" w:line="240" w:lineRule="auto"/>
+            </w:pPr>
+            <w:r>
+              <w:rPr>
+                <w:rFonts w:ascii="Calibri" w:hAnsi="Calibri"/>
+                <w:b w:val="0"/>
+                <w:sz w:val="19"/>
+              </w:rPr>
+            </w:r>
+            <w:r>
+              <w:rPr>
+                <w:rFonts w:ascii="Calibri" w:hAnsi="Calibri"/>
+                <w:b w:val="0"/>
+                <w:sz w:val="19"/>
+              </w:rPr>
+              <w:t>S10</w:t>
+            </w:r>
+          </w:p>
+        </w:tc>
+        <w:tc>
+          <w:tcPr>
+            <w:tcW w:type="dxa" w:w="800"/>
+            <w:tcMar>
+              <w:top w:w="80" w:type="dxa"/>
+              <w:start w:w="120" w:type="dxa"/>
+              <w:bottom w:w="80" w:type="dxa"/>
+              <w:end w:w="120" w:type="dxa"/>
+            </w:tcMar>
+            <w:vAlign w:val="center"/>
+          </w:tcPr>
+          <w:p>
+            <w:pPr>
+              <w:spacing w:before="0" w:after="0" w:line="240" w:lineRule="auto"/>
+              <w:jc w:val="center"/>
+            </w:pPr>
+            <w:r>
+              <w:rPr>
+                <w:rFonts w:ascii="Calibri" w:hAnsi="Calibri"/>
+                <w:b w:val="0"/>
+                <w:sz w:val="19"/>
+              </w:rPr>
+            </w:r>
+            <w:r>
+              <w:rPr>
+                <w:rFonts w:ascii="Calibri" w:hAnsi="Calibri"/>
+                <w:b w:val="0"/>
+                <w:sz w:val="19"/>
+              </w:rPr>
+              <w:t>9704</w:t>
+            </w:r>
+          </w:p>
+        </w:tc>
+        <w:tc>
+          <w:tcPr>
+            <w:tcW w:type="dxa" w:w="2050"/>
+            <w:tcMar>
+              <w:top w:w="80" w:type="dxa"/>
+              <w:start w:w="120" w:type="dxa"/>
+              <w:bottom w:w="80" w:type="dxa"/>
+              <w:end w:w="120" w:type="dxa"/>
+            </w:tcMar>
+            <w:vAlign w:val="center"/>
+          </w:tcPr>
+          <w:p>
+            <w:pPr>
+              <w:spacing w:before="0" w:after="0" w:line="240" w:lineRule="auto"/>
+            </w:pPr>
+            <w:r>
+              <w:rPr>
+                <w:rFonts w:ascii="Calibri" w:hAnsi="Calibri"/>
+                <w:b w:val="0"/>
+                <w:sz w:val="19"/>
+              </w:rPr>
+            </w:r>
+            <w:r>
+              <w:rPr>
+                <w:rFonts w:ascii="Calibri" w:hAnsi="Calibri"/>
+                <w:b w:val="0"/>
+                <w:sz w:val="19"/>
+              </w:rPr>
+              <w:t>52.2 / 58.4</w:t>
+            </w:r>
+          </w:p>
+        </w:tc>
+        <w:tc>
+          <w:tcPr>
+            <w:tcW w:type="dxa" w:w="1660"/>
+            <w:tcMar>
+              <w:top w:w="80" w:type="dxa"/>
+              <w:start w:w="120" w:type="dxa"/>
+              <w:bottom w:w="80" w:type="dxa"/>
+              <w:end w:w="120" w:type="dxa"/>
+            </w:tcMar>
+            <w:vAlign w:val="center"/>
+          </w:tcPr>
+          <w:p>
+            <w:pPr>
+              <w:spacing w:before="0" w:after="0" w:line="240" w:lineRule="auto"/>
+            </w:pPr>
+            <w:r>
+              <w:rPr>
+                <w:rFonts w:ascii="Calibri" w:hAnsi="Calibri"/>
+                <w:b w:val="0"/>
+                <w:sz w:val="19"/>
+              </w:rPr>
+            </w:r>
+            <w:r>
+              <w:rPr>
+                <w:rFonts w:ascii="Calibri" w:hAnsi="Calibri"/>
+                <w:b w:val="0"/>
+                <w:sz w:val="19"/>
+              </w:rPr>
+              <w:t>RNA + V(D)J</w:t>
+            </w:r>
+          </w:p>
+        </w:tc>
+      </w:tr>
+      <w:tr>
+        <w:trPr>
+          <w:cantSplit/>
+        </w:trPr>
+        <w:tc>
+          <w:tcPr>
+            <w:tcW w:type="dxa" w:w="950"/>
+            <w:tcMar>
+              <w:top w:w="80" w:type="dxa"/>
+              <w:start w:w="120" w:type="dxa"/>
+              <w:bottom w:w="80" w:type="dxa"/>
+              <w:end w:w="120" w:type="dxa"/>
+            </w:tcMar>
+            <w:vAlign w:val="center"/>
+          </w:tcPr>
+          <w:p>
+            <w:pPr>
+              <w:spacing w:before="0" w:after="0" w:line="240" w:lineRule="auto"/>
+            </w:pPr>
+            <w:r>
+              <w:rPr>
+                <w:rFonts w:ascii="Calibri" w:hAnsi="Calibri"/>
+                <w:b w:val="0"/>
+                <w:sz w:val="19"/>
+              </w:rPr>
+            </w:r>
+            <w:r>
+              <w:rPr>
+                <w:rFonts w:ascii="Calibri" w:hAnsi="Calibri"/>
+                <w:b w:val="0"/>
+                <w:sz w:val="19"/>
+              </w:rPr>
+              <w:t>Patient 4</w:t>
+            </w:r>
+          </w:p>
+        </w:tc>
+        <w:tc>
+          <w:tcPr>
+            <w:tcW w:type="dxa" w:w="1600"/>
+            <w:tcMar>
+              <w:top w:w="80" w:type="dxa"/>
+              <w:start w:w="120" w:type="dxa"/>
+              <w:bottom w:w="80" w:type="dxa"/>
+              <w:end w:w="120" w:type="dxa"/>
+            </w:tcMar>
+            <w:vAlign w:val="center"/>
+          </w:tcPr>
+          <w:p>
+            <w:pPr>
+              <w:spacing w:before="0" w:after="0" w:line="240" w:lineRule="auto"/>
+            </w:pPr>
+            <w:r>
+              <w:rPr>
+                <w:rFonts w:ascii="Calibri" w:hAnsi="Calibri"/>
+                <w:b w:val="0"/>
+                <w:sz w:val="19"/>
+              </w:rPr>
+            </w:r>
+            <w:r>
+              <w:rPr>
+                <w:rFonts w:ascii="Calibri" w:hAnsi="Calibri"/>
+                <w:b w:val="0"/>
+                <w:sz w:val="19"/>
+              </w:rPr>
+              <w:t>Nonresponder</w:t>
+            </w:r>
+          </w:p>
+        </w:tc>
+        <w:tc>
+          <w:tcPr>
+            <w:tcW w:type="dxa" w:w="1450"/>
+            <w:tcMar>
+              <w:top w:w="80" w:type="dxa"/>
+              <w:start w:w="120" w:type="dxa"/>
+              <w:bottom w:w="80" w:type="dxa"/>
+              <w:end w:w="120" w:type="dxa"/>
+            </w:tcMar>
+            <w:vAlign w:val="center"/>
+          </w:tcPr>
+          <w:p>
+            <w:pPr>
+              <w:spacing w:before="0" w:after="0" w:line="240" w:lineRule="auto"/>
+            </w:pPr>
+            <w:r>
+              <w:rPr>
+                <w:rFonts w:ascii="Calibri" w:hAnsi="Calibri"/>
+                <w:b w:val="0"/>
+                <w:sz w:val="19"/>
+              </w:rPr>
+            </w:r>
+            <w:r>
+              <w:rPr>
+                <w:rFonts w:ascii="Calibri" w:hAnsi="Calibri"/>
+                <w:b w:val="0"/>
+                <w:sz w:val="19"/>
+              </w:rPr>
+              <w:t>Recurrence</w:t>
+            </w:r>
+          </w:p>
+        </w:tc>
+        <w:tc>
+          <w:tcPr>
+            <w:tcW w:type="dxa" w:w="850"/>
+            <w:tcMar>
+              <w:top w:w="80" w:type="dxa"/>
+              <w:start w:w="120" w:type="dxa"/>
+              <w:bottom w:w="80" w:type="dxa"/>
+              <w:end w:w="120" w:type="dxa"/>
+            </w:tcMar>
+            <w:vAlign w:val="center"/>
+          </w:tcPr>
+          <w:p>
+            <w:pPr>
+              <w:spacing w:before="0" w:after="0" w:line="240" w:lineRule="auto"/>
+            </w:pPr>
+            <w:r>
+              <w:rPr>
+                <w:rFonts w:ascii="Calibri" w:hAnsi="Calibri"/>
+                <w:b w:val="0"/>
+                <w:sz w:val="19"/>
+              </w:rPr>
+            </w:r>
+            <w:r>
+              <w:rPr>
+                <w:rFonts w:ascii="Calibri" w:hAnsi="Calibri"/>
+                <w:b w:val="0"/>
+                <w:sz w:val="19"/>
+              </w:rPr>
+              <w:t>S11</w:t>
+            </w:r>
+          </w:p>
+        </w:tc>
+        <w:tc>
+          <w:tcPr>
+            <w:tcW w:type="dxa" w:w="800"/>
+            <w:tcMar>
+              <w:top w:w="80" w:type="dxa"/>
+              <w:start w:w="120" w:type="dxa"/>
+              <w:bottom w:w="80" w:type="dxa"/>
+              <w:end w:w="120" w:type="dxa"/>
+            </w:tcMar>
+            <w:vAlign w:val="center"/>
+          </w:tcPr>
+          <w:p>
+            <w:pPr>
+              <w:spacing w:before="0" w:after="0" w:line="240" w:lineRule="auto"/>
+              <w:jc w:val="center"/>
+            </w:pPr>
+            <w:r>
+              <w:rPr>
+                <w:rFonts w:ascii="Calibri" w:hAnsi="Calibri"/>
+                <w:b w:val="0"/>
+                <w:sz w:val="19"/>
+              </w:rPr>
+            </w:r>
+            <w:r>
+              <w:rPr>
+                <w:rFonts w:ascii="Calibri" w:hAnsi="Calibri"/>
+                <w:b w:val="0"/>
+                <w:sz w:val="19"/>
+              </w:rPr>
+              <w:t>9330</w:t>
+            </w:r>
+          </w:p>
+        </w:tc>
+        <w:tc>
+          <w:tcPr>
+            <w:tcW w:type="dxa" w:w="2050"/>
+            <w:tcMar>
+              <w:top w:w="80" w:type="dxa"/>
+              <w:start w:w="120" w:type="dxa"/>
+              <w:bottom w:w="80" w:type="dxa"/>
+              <w:end w:w="120" w:type="dxa"/>
+            </w:tcMar>
+            <w:vAlign w:val="center"/>
+          </w:tcPr>
+          <w:p>
+            <w:pPr>
+              <w:spacing w:before="0" w:after="0" w:line="240" w:lineRule="auto"/>
+            </w:pPr>
+            <w:r>
+              <w:rPr>
+                <w:rFonts w:ascii="Calibri" w:hAnsi="Calibri"/>
+                <w:b w:val="0"/>
+                <w:sz w:val="19"/>
+              </w:rPr>
+            </w:r>
+            <w:r>
+              <w:rPr>
+                <w:rFonts w:ascii="Calibri" w:hAnsi="Calibri"/>
+                <w:b w:val="0"/>
+                <w:sz w:val="19"/>
+              </w:rPr>
+              <w:t>40.5 / 45.6</w:t>
+            </w:r>
+          </w:p>
+        </w:tc>
+        <w:tc>
+          <w:tcPr>
+            <w:tcW w:type="dxa" w:w="1660"/>
+            <w:tcMar>
+              <w:top w:w="80" w:type="dxa"/>
+              <w:start w:w="120" w:type="dxa"/>
+              <w:bottom w:w="80" w:type="dxa"/>
+              <w:end w:w="120" w:type="dxa"/>
+            </w:tcMar>
+            <w:vAlign w:val="center"/>
+          </w:tcPr>
+          <w:p>
+            <w:pPr>
+              <w:spacing w:before="0" w:after="0" w:line="240" w:lineRule="auto"/>
+            </w:pPr>
+            <w:r>
+              <w:rPr>
+                <w:rFonts w:ascii="Calibri" w:hAnsi="Calibri"/>
+                <w:b w:val="0"/>
+                <w:sz w:val="19"/>
+              </w:rPr>
+            </w:r>
+            <w:r>
+              <w:rPr>
+                <w:rFonts w:ascii="Calibri" w:hAnsi="Calibri"/>
+                <w:b w:val="0"/>
+                <w:sz w:val="19"/>
+              </w:rPr>
+              <w:t>RNA + V(D)J</w:t>
+            </w:r>
+          </w:p>
+        </w:tc>
+      </w:tr>
+    </w:tbl>
+    <w:p>
+      <w:pPr>
+        <w:spacing w:after="40"/>
+      </w:pPr>
+    </w:p>
+    <w:p>
+      <w:pPr>
         <w:pStyle w:val="Heading2"/>
       </w:pPr>
       <w:r>
@@ -1374,7 +4180,7 @@
     </w:p>
     <w:p>
       <w:r>
-        <w:t>The archived run used Python 3.12.13, NumPy 2.0.2, pandas 2.3.3, scikit-learn 1.6.1 [35], XGBoost 3.2.0, TensorFlow 2.20.0, SHAP 0.51.0, and Optuna 4.9.0. The fixed random seed was 93768. The executable exports cell-, sample-, patient-, fold-, and pooled metrics; clustered CIs; hyperparameters; preprocessing objects; PCA variance; loss curves; attribution summaries; sensitivity analyses; robustness controls; and software metadata. Standalone figures are saved without embedded titles or captions at 600 dots per inch. Reporting was aligned with the emphasis of TRIPOD+AI on transparent clinical prediction-model methods and limitations [30].</w:t>
+        <w:t>The supplied result archive used Python 3.12.13, NumPy 2.0.2, pandas 2.3.3, scikit-learn 1.6.1 [35], XGBoost 3.2.0, TensorFlow 2.20.0, SHAP 0.51.0, and Optuna 4.9.0. The fixed random seed was 93768. The executable exports cell-, sample-, patient-, fold-, and pooled metrics; clustered CIs; hyperparameters; preprocessing objects; PCA variance; loss curves; attribution summaries; sensitivity analyses; robustness controls; and software metadata. For the reported cell-level CIs, the archived out-of-fold cell predictions were re-scored after resampling complete patient clusters; patient-level CIs were calculated from the corresponding patient means. Standalone figures are saved without embedded titles or captions at 600 dots per inch. Reporting was aligned with the emphasis of TRIPOD+AI on transparent clinical prediction-model methods and limitations [30].</w:t>
       </w:r>
     </w:p>
     <w:p>
@@ -1408,7 +4214,7 @@
     </w:p>
     <w:p>
       <w:r>
-        <w:t>The baseline cohort contained 39,532 cells, with 8931-11,480 cells per patient (Table 1). A productive alpha or beta chain was observed in 35.4%-56.4% of cells across patients. At baseline, 45.0% of responder cells and 53.3% of nonresponder cells contained at least one productive chain. These are descriptive cell fractions rather than independent group estimates. The all-timepoint cohort contained the original 100,067 cells across 11 samples; the recurrence sample S8 contributed 12,832 gene-expression profiles with both receptor chains coded as missing.</w:t>
+        <w:t>The baseline cohort contained 39,532 cells, with 8931-11,480 cells per patient (Table 1). The full longitudinal distribution is shown in Table 2. A productive alpha or beta chain was observed in 35.4%-56.4% of cells across patients. At baseline, 45.0% of responder cells and 53.3% of nonresponder cells contained at least one productive chain. These are descriptive cell fractions rather than independent group estimates. Patient-level expanded-clonotype cell fractions ranged from 0.135 to 0.205 among responders and from 0.138 to 0.232 among nonresponders; these descriptive values were not tested as independent group evidence. The all-timepoint cohort contained the original 100,067 cells across 11 samples; the recurrence sample S8 contributed 12,832 gene-expression profiles with both receptor chains coded as missing.</w:t>
       </w:r>
     </w:p>
     <w:p>
@@ -1483,7 +4289,7 @@
     </w:p>
     <w:p>
       <w:r>
-        <w:t>The neural models produced high pooled cell-level discrimination, with AUROCs from 0.996 to 1.000 and patient-clustered CIs shown in Table 2. Patient aggregation yielded the same ordering for every neural architecture: the mean probabilities of both responders exceeded 0.50 and those of both nonresponders were below 0.50 (Table 3 and Figure 2). Thus, neural patient-level AUROC and accuracy were 1.00. The MLP had the lowest pooled cell Brier score (0.00047), while the Transformer Brier score was 0.0229. The archived XGBoost run reversed the patient ordering and had AUROC and accuracy of 0.00; because its learning-rate search was defective, it cannot support a fair architecture comparison.</w:t>
+        <w:t>The neural models produced high pooled cell-level discrimination, with AUROCs from 0.996 to 1.000 and patient-clustered CIs shown in Table 3. Patient aggregation yielded the same ordering for every neural architecture: the mean probabilities of both responders exceeded 0.50 and those of both nonresponders were below 0.50 (Table 4 and Figure 2). Thus, neural patient-level AUROC and accuracy were 1.00. The MLP had the lowest pooled cell Brier score (0.00047), while the Transformer Brier score was 0.0229. Patient expected calibration error was 0.0010 for the MLP, 0.0439 for the CNN, 0.0297 for the BiLSTM, and 0.0307 for the Transformer. The archived XGBoost run reversed the patient ordering and had AUROC and accuracy of 0.00; because its learning-rate search was defective, it cannot support a fair architecture comparison.</w:t>
       </w:r>
     </w:p>
     <w:p>
@@ -1492,7 +4298,7 @@
         <w:keepNext/>
       </w:pPr>
       <w:r>
-        <w:t>Table 2. Pooled out-of-fold performance with patient-clustered 95% confidence intervals.</w:t>
+        <w:t>Table 3. Pooled out-of-fold performance with patient-clustered 95% confidence intervals.</w:t>
       </w:r>
     </w:p>
     <w:tbl>
@@ -3348,7 +6154,7 @@
         <w:keepNext/>
       </w:pPr>
       <w:r>
-        <w:t>Table 3. Mean response probabilities for each held-out patient.</w:t>
+        <w:t>Table 4. Mean response probabilities for each held-out patient.</w:t>
       </w:r>
     </w:p>
     <w:tbl>
@@ -4443,6 +7249,15 @@
       </w:r>
     </w:p>
     <w:p>
+      <w:pPr>
+        <w:pStyle w:val="CaptionText"/>
+        <w:keepNext/>
+      </w:pPr>
+      <w:r>
+        <w:t>Table 4 is also the fold-level patient report: each column corresponds to the single patient held out in one outer LOPO fold. Conventional AUROC cannot be estimated within an individual fold because the held-out fold contains only one outcome unit; the pooled patient metrics therefore summarize the four fold-level probabilities.</w:t>
+      </w:r>
+    </w:p>
+    <w:p>
       <w:r>
         <w:t>The apparently perfect neural patient metrics represent only 4 predictions. Every valid two-class bootstrap resample preserved their ordering, so the patient-level CIs were degenerate at 1.00. Exact enumeration of the 6 balanced patient-label assignments yielded a minimum attainable one-sided P value of .167. When the Transformer was retrained under 5 shuffled balanced assignments, 1 shuffled assignment also achieved AUROC 1.00, producing an empirical P value of .33. Accordingly, the observed separation was not statistically distinguishable from the patient-label null at P&lt;.05.</w:t>
       </w:r>
@@ -4457,7 +7272,7 @@
     </w:p>
     <w:p>
       <w:r>
-        <w:t>The baseline transcriptome-only Transformer retained cell-level AUROC 1.000 (95% CI 1.000-1.000) and patient-level AUROC 1.00. In contrast, the TCR-only Transformer reversed the cell and patient ordering (AUROC 0.00). Adding receptor features did not improve discrimination over the transcriptome-only representation in this cohort. Longitudinal combined-feature analyses also separated the 4 patients, whether recurrence samples were excluded or all 11 samples were included (Table 4), but these analyses classify observations collected after treatment and cannot be interpreted as prospective baseline prediction.</w:t>
+        <w:t>The baseline transcriptome-only Transformer retained cell-level AUROC 1.000 (95% CI 1.000-1.000) and patient-level AUROC 1.00. In contrast, the TCR-only Transformer reversed the cell and patient ordering (AUROC 0.00). Adding receptor features did not improve discrimination over the transcriptome-only representation in this cohort. Longitudinal combined-feature analyses also separated the 4 patients, whether recurrence samples were excluded or all 11 samples were included (Table 5), but these analyses classify observations collected after treatment and cannot be interpreted as prospective baseline prediction.</w:t>
       </w:r>
     </w:p>
     <w:p>
@@ -4466,7 +7281,7 @@
         <w:keepNext/>
       </w:pPr>
       <w:r>
-        <w:t>Table 4. Transformer sensitivity analyses.</w:t>
+        <w:t>Table 5. Transformer sensitivity analyses.</w:t>
       </w:r>
     </w:p>
     <w:tbl>
@@ -5788,7 +8603,7 @@
     </w:p>
     <w:p>
       <w:r>
-        <w:t>Back-projection through PCA loadings ranked CD14, CLIC3, S100A12, MT-CO2, MATK, CCL4, MS4A6A, IL2RB, FGFBP2, KLRF1, KLRG1, and GZMH among the leading genes. Prespecified attribution enrichment was strongest for mitochondrial, cytotoxic-effector, memory/naive, and T-cell activation sets; interferon-response attribution was also above its random-set null, whereas the exhaustion/checkpoint set had no mapped attribution (Table 5). These empirical values quantify where this fitted model concentrated attribution and are not patient-level biological association P values.</w:t>
+        <w:t>Back-projection through PCA loadings ranked CD14, CLIC3, S100A12, MT-CO2, MATK, CCL4, MS4A6A, IL2RB, FGFBP2, KLRF1, KLRG1, and GZMH among the leading genes. Prespecified attribution enrichment was strongest for mitochondrial, cytotoxic-effector, memory/naive, and T-cell activation sets; interferon-response attribution was also above its random-set null, whereas the exhaustion/checkpoint set had no mapped attribution (Table 6). These empirical values quantify where this fitted model concentrated attribution and are not patient-level biological association P values.</w:t>
       </w:r>
     </w:p>
     <w:p>
@@ -5797,7 +8612,7 @@
         <w:keepNext/>
       </w:pPr>
       <w:r>
-        <w:t>Table 5. Selected gene and pathway attribution results from the Transformer.</w:t>
+        <w:t>Table 6. Selected gene and pathway attribution results from the Transformer.</w:t>
       </w:r>
     </w:p>
     <w:tbl>
@@ -8046,7 +10861,7 @@
     </w:p>
     <w:p>
       <w:r>
-        <w:t>The source dataset is publicly available from the Gene Expression Omnibus under accession GSE300475. The revised analysis executable regenerates processed features from the public raw files and exports aggregate metrics, figures, model settings, and software metadata. Public repository information should be added to the journal metadata when the revision is committed and uploaded.</w:t>
+        <w:t>The source dataset is publicly available from the Gene Expression Omnibus under accession GSE300475. The revised analysis executable regenerates processed features from the public raw files and exports aggregate metrics, figures, model settings, and software metadata. Code and manuscript sources are available at https://github.com/Anmol-Josan/Predicting-Chemo-immunotherapy-Response-in-Early-Stage-Hormone-Receptor-Positive-Breast-Cancer.</w:t>
       </w:r>
     </w:p>
     <w:p>

</xml_diff>